<commit_message>
Combat Mindset Conditioning: document set in the black and grey palette
Co-Authored-By: Claude Fable 5.1 <noreply@anthropic.com>
Claude-Session: https://claude.ai/code/session_01LgFPs3fMSncBgbYQ3PfA3o
</commit_message>
<xml_diff>
--- a/output/combat-mindset-conditioning.docx
+++ b/output/combat-mindset-conditioning.docx
@@ -82,7 +82,7 @@
           <w:rFonts w:cs="Arial"/>
           <w:b/>
           <w:i w:val="false"/>
-          <w:color w:val="002516"/>
+          <w:color w:val="222222"/>
           <w:spacing w:val="30"/>
           <w:sz w:val="19"/>
         </w:rPr>
@@ -101,7 +101,7 @@
           <w:rFonts w:cs="Arial"/>
           <w:b w:val="false"/>
           <w:i w:val="false"/>
-          <w:color w:val="002516"/>
+          <w:color w:val="222222"/>
           <w:sz w:val="20"/>
         </w:rPr>
         <w:t>Army Command School</w:t>
@@ -119,7 +119,7 @@
           <w:rFonts w:cs="Arial"/>
           <w:b/>
           <w:i w:val="false"/>
-          <w:color w:val="002516"/>
+          <w:color w:val="222222"/>
           <w:sz w:val="18"/>
         </w:rPr>
         <w:t xml:space="preserve">Date: </w:t>
@@ -139,7 +139,7 @@
           <w:rFonts w:cs="Arial"/>
           <w:b w:val="false"/>
           <w:i w:val="false"/>
-          <w:color w:val="A89662"/>
+          <w:color w:val="8A8A8A"/>
           <w:sz w:val="18"/>
         </w:rPr>
         <w:t xml:space="preserve">   ·   </w:t>
@@ -149,7 +149,7 @@
           <w:rFonts w:cs="Arial"/>
           <w:b/>
           <w:i w:val="false"/>
-          <w:color w:val="002516"/>
+          <w:color w:val="222222"/>
           <w:sz w:val="18"/>
         </w:rPr>
         <w:t xml:space="preserve">Status: </w:t>
@@ -186,7 +186,7 @@
           <w:rFonts w:cs="Arial"/>
           <w:b/>
           <w:i w:val="false"/>
-          <w:color w:val="002516"/>
+          <w:color w:val="222222"/>
           <w:sz w:val="25"/>
         </w:rPr>
         <w:t>Purpose</w:t>
@@ -213,7 +213,7 @@
         <w:pBdr>
           <w:left w:val="single" w:sz="28" w:space="8" w:color="C62026"/>
         </w:pBdr>
-        <w:shd w:val="clear" w:color="auto" w:fill="CDD2B7"/>
+        <w:shd w:val="clear" w:color="auto" w:fill="E6E6E2"/>
         <w:spacing w:before="160" w:after="160"/>
         <w:ind w:left="283" w:right="283"/>
         <w:rPr/>
@@ -276,7 +276,7 @@
           <w:rFonts w:cs="Arial"/>
           <w:b/>
           <w:i w:val="false"/>
-          <w:color w:val="002516"/>
+          <w:color w:val="222222"/>
           <w:sz w:val="25"/>
         </w:rPr>
         <w:t>Working Terminology</w:t>
@@ -325,17 +325,16 @@
           <w:tcPr>
             <w:tcW w:w="2040" w:type="dxa"/>
             <w:tcBorders>
-              <w:top w:val="single" w:sz="4" w:space="0" w:color="A89662"/>
-              <w:left w:val="single" w:sz="4" w:space="0" w:color="A89662"/>
-              <w:bottom w:val="single" w:sz="4" w:space="0" w:color="D9D9D2"/>
-              <w:right w:val="single" w:sz="4" w:space="0" w:color="D9D9D2"/>
-            </w:tcBorders>
-            <w:shd w:color="auto" w:fill="002516" w:val="clear"/>
-          </w:tcPr>
-          <w:p>
-            <w:pPr>
-              <w:pStyle w:val="Normal"/>
-              <w:keepNext w:val="true"/>
+              <w:top w:val="single" w:sz="4" w:space="0" w:color="8A8A8A"/>
+              <w:left w:val="single" w:sz="4" w:space="0" w:color="8A8A8A"/>
+              <w:bottom w:val="single" w:sz="4" w:space="0" w:color="D9D9D2"/>
+              <w:right w:val="single" w:sz="4" w:space="0" w:color="D9D9D2"/>
+            </w:tcBorders>
+            <w:shd w:color="auto" w:fill="222222" w:val="clear"/>
+          </w:tcPr>
+          <w:p>
+            <w:pPr>
+              <w:pStyle w:val="Normal"/>
               <w:spacing w:lineRule="auto" w:line="252" w:before="0" w:after="0"/>
               <w:rPr/>
             </w:pPr>
@@ -355,17 +354,16 @@
           <w:tcPr>
             <w:tcW w:w="3629" w:type="dxa"/>
             <w:tcBorders>
-              <w:top w:val="single" w:sz="4" w:space="0" w:color="A89662"/>
-              <w:left w:val="single" w:sz="4" w:space="0" w:color="D9D9D2"/>
-              <w:bottom w:val="single" w:sz="4" w:space="0" w:color="D9D9D2"/>
-              <w:right w:val="single" w:sz="4" w:space="0" w:color="D9D9D2"/>
-            </w:tcBorders>
-            <w:shd w:color="auto" w:fill="002516" w:val="clear"/>
-          </w:tcPr>
-          <w:p>
-            <w:pPr>
-              <w:pStyle w:val="Normal"/>
-              <w:keepNext w:val="true"/>
+              <w:top w:val="single" w:sz="4" w:space="0" w:color="8A8A8A"/>
+              <w:left w:val="single" w:sz="4" w:space="0" w:color="D9D9D2"/>
+              <w:bottom w:val="single" w:sz="4" w:space="0" w:color="D9D9D2"/>
+              <w:right w:val="single" w:sz="4" w:space="0" w:color="D9D9D2"/>
+            </w:tcBorders>
+            <w:shd w:color="auto" w:fill="222222" w:val="clear"/>
+          </w:tcPr>
+          <w:p>
+            <w:pPr>
+              <w:pStyle w:val="Normal"/>
               <w:spacing w:lineRule="auto" w:line="252" w:before="0" w:after="0"/>
               <w:rPr/>
             </w:pPr>
@@ -385,17 +383,16 @@
           <w:tcPr>
             <w:tcW w:w="3628" w:type="dxa"/>
             <w:tcBorders>
-              <w:top w:val="single" w:sz="4" w:space="0" w:color="A89662"/>
-              <w:left w:val="single" w:sz="4" w:space="0" w:color="D9D9D2"/>
-              <w:bottom w:val="single" w:sz="4" w:space="0" w:color="D9D9D2"/>
-              <w:right w:val="single" w:sz="4" w:space="0" w:color="A89662"/>
-            </w:tcBorders>
-            <w:shd w:color="auto" w:fill="002516" w:val="clear"/>
-          </w:tcPr>
-          <w:p>
-            <w:pPr>
-              <w:pStyle w:val="Normal"/>
-              <w:keepNext w:val="true"/>
+              <w:top w:val="single" w:sz="4" w:space="0" w:color="8A8A8A"/>
+              <w:left w:val="single" w:sz="4" w:space="0" w:color="D9D9D2"/>
+              <w:bottom w:val="single" w:sz="4" w:space="0" w:color="D9D9D2"/>
+              <w:right w:val="single" w:sz="4" w:space="0" w:color="8A8A8A"/>
+            </w:tcBorders>
+            <w:shd w:color="auto" w:fill="222222" w:val="clear"/>
+          </w:tcPr>
+          <w:p>
+            <w:pPr>
+              <w:pStyle w:val="Normal"/>
               <w:spacing w:lineRule="auto" w:line="252" w:before="0" w:after="0"/>
               <w:rPr/>
             </w:pPr>
@@ -421,16 +418,15 @@
             <w:tcW w:w="2040" w:type="dxa"/>
             <w:tcBorders>
               <w:top w:val="single" w:sz="4" w:space="0" w:color="D9D9D2"/>
-              <w:left w:val="single" w:sz="4" w:space="0" w:color="A89662"/>
-              <w:bottom w:val="single" w:sz="4" w:space="0" w:color="D9D9D2"/>
-              <w:right w:val="single" w:sz="4" w:space="0" w:color="D9D9D2"/>
-            </w:tcBorders>
-            <w:shd w:color="auto" w:fill="CDD2B7" w:val="clear"/>
-          </w:tcPr>
-          <w:p>
-            <w:pPr>
-              <w:pStyle w:val="Normal"/>
-              <w:keepNext w:val="true"/>
+              <w:left w:val="single" w:sz="4" w:space="0" w:color="8A8A8A"/>
+              <w:bottom w:val="single" w:sz="4" w:space="0" w:color="D9D9D2"/>
+              <w:right w:val="single" w:sz="4" w:space="0" w:color="D9D9D2"/>
+            </w:tcBorders>
+            <w:shd w:color="auto" w:fill="E6E6E2" w:val="clear"/>
+          </w:tcPr>
+          <w:p>
+            <w:pPr>
+              <w:pStyle w:val="Normal"/>
               <w:spacing w:lineRule="auto" w:line="252" w:before="0" w:after="0"/>
               <w:rPr/>
             </w:pPr>
@@ -439,7 +435,7 @@
                 <w:rFonts w:cs="Arial"/>
                 <w:b/>
                 <w:i w:val="false"/>
-                <w:color w:val="002516"/>
+                <w:color w:val="222222"/>
                 <w:sz w:val="17"/>
               </w:rPr>
               <w:t>COGCON</w:t>
@@ -459,7 +455,6 @@
           <w:p>
             <w:pPr>
               <w:pStyle w:val="Normal"/>
-              <w:keepNext w:val="true"/>
               <w:spacing w:lineRule="auto" w:line="252" w:before="0" w:after="0"/>
               <w:rPr/>
             </w:pPr>
@@ -481,13 +476,12 @@
               <w:top w:val="single" w:sz="4" w:space="0" w:color="D9D9D2"/>
               <w:left w:val="single" w:sz="4" w:space="0" w:color="D9D9D2"/>
               <w:bottom w:val="single" w:sz="4" w:space="0" w:color="D9D9D2"/>
-              <w:right w:val="single" w:sz="4" w:space="0" w:color="A89662"/>
-            </w:tcBorders>
-          </w:tcPr>
-          <w:p>
-            <w:pPr>
-              <w:pStyle w:val="Normal"/>
-              <w:keepNext w:val="true"/>
+              <w:right w:val="single" w:sz="4" w:space="0" w:color="8A8A8A"/>
+            </w:tcBorders>
+          </w:tcPr>
+          <w:p>
+            <w:pPr>
+              <w:pStyle w:val="Normal"/>
               <w:spacing w:lineRule="auto" w:line="252" w:before="0" w:after="0"/>
               <w:rPr/>
             </w:pPr>
@@ -512,16 +506,15 @@
             <w:tcW w:w="2040" w:type="dxa"/>
             <w:tcBorders>
               <w:top w:val="single" w:sz="4" w:space="0" w:color="D9D9D2"/>
-              <w:left w:val="single" w:sz="4" w:space="0" w:color="A89662"/>
-              <w:bottom w:val="single" w:sz="4" w:space="0" w:color="D9D9D2"/>
-              <w:right w:val="single" w:sz="4" w:space="0" w:color="D9D9D2"/>
-            </w:tcBorders>
-            <w:shd w:color="auto" w:fill="CDD2B7" w:val="clear"/>
-          </w:tcPr>
-          <w:p>
-            <w:pPr>
-              <w:pStyle w:val="Normal"/>
-              <w:keepNext w:val="true"/>
+              <w:left w:val="single" w:sz="4" w:space="0" w:color="8A8A8A"/>
+              <w:bottom w:val="single" w:sz="4" w:space="0" w:color="D9D9D2"/>
+              <w:right w:val="single" w:sz="4" w:space="0" w:color="D9D9D2"/>
+            </w:tcBorders>
+            <w:shd w:color="auto" w:fill="E6E6E2" w:val="clear"/>
+          </w:tcPr>
+          <w:p>
+            <w:pPr>
+              <w:pStyle w:val="Normal"/>
               <w:spacing w:lineRule="auto" w:line="252" w:before="0" w:after="0"/>
               <w:rPr/>
             </w:pPr>
@@ -530,7 +523,7 @@
                 <w:rFonts w:cs="Arial"/>
                 <w:b/>
                 <w:i w:val="false"/>
-                <w:color w:val="002516"/>
+                <w:color w:val="222222"/>
                 <w:sz w:val="17"/>
               </w:rPr>
               <w:t>COG6, the six cognitive pillars</w:t>
@@ -550,7 +543,6 @@
           <w:p>
             <w:pPr>
               <w:pStyle w:val="Normal"/>
-              <w:keepNext w:val="true"/>
               <w:spacing w:lineRule="auto" w:line="252" w:before="0" w:after="0"/>
               <w:rPr/>
             </w:pPr>
@@ -572,13 +564,12 @@
               <w:top w:val="single" w:sz="4" w:space="0" w:color="D9D9D2"/>
               <w:left w:val="single" w:sz="4" w:space="0" w:color="D9D9D2"/>
               <w:bottom w:val="single" w:sz="4" w:space="0" w:color="D9D9D2"/>
-              <w:right w:val="single" w:sz="4" w:space="0" w:color="A89662"/>
-            </w:tcBorders>
-          </w:tcPr>
-          <w:p>
-            <w:pPr>
-              <w:pStyle w:val="Normal"/>
-              <w:keepNext w:val="true"/>
+              <w:right w:val="single" w:sz="4" w:space="0" w:color="8A8A8A"/>
+            </w:tcBorders>
+          </w:tcPr>
+          <w:p>
+            <w:pPr>
+              <w:pStyle w:val="Normal"/>
               <w:spacing w:lineRule="auto" w:line="252" w:before="0" w:after="0"/>
               <w:rPr/>
             </w:pPr>
@@ -603,16 +594,15 @@
             <w:tcW w:w="2040" w:type="dxa"/>
             <w:tcBorders>
               <w:top w:val="single" w:sz="4" w:space="0" w:color="D9D9D2"/>
-              <w:left w:val="single" w:sz="4" w:space="0" w:color="A89662"/>
-              <w:bottom w:val="single" w:sz="4" w:space="0" w:color="D9D9D2"/>
-              <w:right w:val="single" w:sz="4" w:space="0" w:color="D9D9D2"/>
-            </w:tcBorders>
-            <w:shd w:color="auto" w:fill="CDD2B7" w:val="clear"/>
-          </w:tcPr>
-          <w:p>
-            <w:pPr>
-              <w:pStyle w:val="Normal"/>
-              <w:keepNext w:val="true"/>
+              <w:left w:val="single" w:sz="4" w:space="0" w:color="8A8A8A"/>
+              <w:bottom w:val="single" w:sz="4" w:space="0" w:color="D9D9D2"/>
+              <w:right w:val="single" w:sz="4" w:space="0" w:color="D9D9D2"/>
+            </w:tcBorders>
+            <w:shd w:color="auto" w:fill="E6E6E2" w:val="clear"/>
+          </w:tcPr>
+          <w:p>
+            <w:pPr>
+              <w:pStyle w:val="Normal"/>
               <w:spacing w:lineRule="auto" w:line="252" w:before="0" w:after="0"/>
               <w:rPr/>
             </w:pPr>
@@ -621,7 +611,7 @@
                 <w:rFonts w:cs="Arial"/>
                 <w:b/>
                 <w:i w:val="false"/>
-                <w:color w:val="002516"/>
+                <w:color w:val="222222"/>
                 <w:sz w:val="17"/>
               </w:rPr>
               <w:t>Operational Reset Tool</w:t>
@@ -641,7 +631,6 @@
           <w:p>
             <w:pPr>
               <w:pStyle w:val="Normal"/>
-              <w:keepNext w:val="true"/>
               <w:spacing w:lineRule="auto" w:line="252" w:before="0" w:after="0"/>
               <w:rPr/>
             </w:pPr>
@@ -663,13 +652,12 @@
               <w:top w:val="single" w:sz="4" w:space="0" w:color="D9D9D2"/>
               <w:left w:val="single" w:sz="4" w:space="0" w:color="D9D9D2"/>
               <w:bottom w:val="single" w:sz="4" w:space="0" w:color="D9D9D2"/>
-              <w:right w:val="single" w:sz="4" w:space="0" w:color="A89662"/>
-            </w:tcBorders>
-          </w:tcPr>
-          <w:p>
-            <w:pPr>
-              <w:pStyle w:val="Normal"/>
-              <w:keepNext w:val="true"/>
+              <w:right w:val="single" w:sz="4" w:space="0" w:color="8A8A8A"/>
+            </w:tcBorders>
+          </w:tcPr>
+          <w:p>
+            <w:pPr>
+              <w:pStyle w:val="Normal"/>
               <w:spacing w:lineRule="auto" w:line="252" w:before="0" w:after="0"/>
               <w:rPr/>
             </w:pPr>
@@ -694,16 +682,15 @@
             <w:tcW w:w="2040" w:type="dxa"/>
             <w:tcBorders>
               <w:top w:val="single" w:sz="4" w:space="0" w:color="D9D9D2"/>
-              <w:left w:val="single" w:sz="4" w:space="0" w:color="A89662"/>
-              <w:bottom w:val="single" w:sz="4" w:space="0" w:color="D9D9D2"/>
-              <w:right w:val="single" w:sz="4" w:space="0" w:color="D9D9D2"/>
-            </w:tcBorders>
-            <w:shd w:color="auto" w:fill="CDD2B7" w:val="clear"/>
-          </w:tcPr>
-          <w:p>
-            <w:pPr>
-              <w:pStyle w:val="Normal"/>
-              <w:keepNext w:val="true"/>
+              <w:left w:val="single" w:sz="4" w:space="0" w:color="8A8A8A"/>
+              <w:bottom w:val="single" w:sz="4" w:space="0" w:color="D9D9D2"/>
+              <w:right w:val="single" w:sz="4" w:space="0" w:color="D9D9D2"/>
+            </w:tcBorders>
+            <w:shd w:color="auto" w:fill="E6E6E2" w:val="clear"/>
+          </w:tcPr>
+          <w:p>
+            <w:pPr>
+              <w:pStyle w:val="Normal"/>
               <w:spacing w:lineRule="auto" w:line="252" w:before="0" w:after="0"/>
               <w:rPr/>
             </w:pPr>
@@ -712,7 +699,7 @@
                 <w:rFonts w:cs="Arial"/>
                 <w:b/>
                 <w:i w:val="false"/>
-                <w:color w:val="002516"/>
+                <w:color w:val="222222"/>
                 <w:sz w:val="17"/>
               </w:rPr>
               <w:t>OPS4, the Operational Performance States</w:t>
@@ -732,7 +719,6 @@
           <w:p>
             <w:pPr>
               <w:pStyle w:val="Normal"/>
-              <w:keepNext w:val="true"/>
               <w:spacing w:lineRule="auto" w:line="252" w:before="0" w:after="0"/>
               <w:rPr/>
             </w:pPr>
@@ -754,13 +740,12 @@
               <w:top w:val="single" w:sz="4" w:space="0" w:color="D9D9D2"/>
               <w:left w:val="single" w:sz="4" w:space="0" w:color="D9D9D2"/>
               <w:bottom w:val="single" w:sz="4" w:space="0" w:color="D9D9D2"/>
-              <w:right w:val="single" w:sz="4" w:space="0" w:color="A89662"/>
-            </w:tcBorders>
-          </w:tcPr>
-          <w:p>
-            <w:pPr>
-              <w:pStyle w:val="Normal"/>
-              <w:keepNext w:val="true"/>
+              <w:right w:val="single" w:sz="4" w:space="0" w:color="8A8A8A"/>
+            </w:tcBorders>
+          </w:tcPr>
+          <w:p>
+            <w:pPr>
+              <w:pStyle w:val="Normal"/>
               <w:spacing w:lineRule="auto" w:line="252" w:before="0" w:after="0"/>
               <w:rPr/>
             </w:pPr>
@@ -785,16 +770,15 @@
             <w:tcW w:w="2040" w:type="dxa"/>
             <w:tcBorders>
               <w:top w:val="single" w:sz="4" w:space="0" w:color="D9D9D2"/>
-              <w:left w:val="single" w:sz="4" w:space="0" w:color="A89662"/>
-              <w:bottom w:val="single" w:sz="4" w:space="0" w:color="D9D9D2"/>
-              <w:right w:val="single" w:sz="4" w:space="0" w:color="D9D9D2"/>
-            </w:tcBorders>
-            <w:shd w:color="auto" w:fill="CDD2B7" w:val="clear"/>
-          </w:tcPr>
-          <w:p>
-            <w:pPr>
-              <w:pStyle w:val="Normal"/>
-              <w:keepNext w:val="true"/>
+              <w:left w:val="single" w:sz="4" w:space="0" w:color="8A8A8A"/>
+              <w:bottom w:val="single" w:sz="4" w:space="0" w:color="D9D9D2"/>
+              <w:right w:val="single" w:sz="4" w:space="0" w:color="D9D9D2"/>
+            </w:tcBorders>
+            <w:shd w:color="auto" w:fill="E6E6E2" w:val="clear"/>
+          </w:tcPr>
+          <w:p>
+            <w:pPr>
+              <w:pStyle w:val="Normal"/>
               <w:spacing w:lineRule="auto" w:line="252" w:before="0" w:after="0"/>
               <w:rPr/>
             </w:pPr>
@@ -803,7 +787,7 @@
                 <w:rFonts w:cs="Arial"/>
                 <w:b/>
                 <w:i w:val="false"/>
-                <w:color w:val="002516"/>
+                <w:color w:val="222222"/>
                 <w:sz w:val="17"/>
               </w:rPr>
               <w:t>COGCON Coach</w:t>
@@ -823,7 +807,6 @@
           <w:p>
             <w:pPr>
               <w:pStyle w:val="Normal"/>
-              <w:keepNext w:val="true"/>
               <w:spacing w:lineRule="auto" w:line="252" w:before="0" w:after="0"/>
               <w:rPr/>
             </w:pPr>
@@ -845,13 +828,12 @@
               <w:top w:val="single" w:sz="4" w:space="0" w:color="D9D9D2"/>
               <w:left w:val="single" w:sz="4" w:space="0" w:color="D9D9D2"/>
               <w:bottom w:val="single" w:sz="4" w:space="0" w:color="D9D9D2"/>
-              <w:right w:val="single" w:sz="4" w:space="0" w:color="A89662"/>
-            </w:tcBorders>
-          </w:tcPr>
-          <w:p>
-            <w:pPr>
-              <w:pStyle w:val="Normal"/>
-              <w:keepNext w:val="true"/>
+              <w:right w:val="single" w:sz="4" w:space="0" w:color="8A8A8A"/>
+            </w:tcBorders>
+          </w:tcPr>
+          <w:p>
+            <w:pPr>
+              <w:pStyle w:val="Normal"/>
               <w:spacing w:lineRule="auto" w:line="252" w:before="0" w:after="0"/>
               <w:rPr/>
             </w:pPr>
@@ -876,16 +858,15 @@
             <w:tcW w:w="2040" w:type="dxa"/>
             <w:tcBorders>
               <w:top w:val="single" w:sz="4" w:space="0" w:color="D9D9D2"/>
-              <w:left w:val="single" w:sz="4" w:space="0" w:color="A89662"/>
-              <w:bottom w:val="single" w:sz="4" w:space="0" w:color="D9D9D2"/>
-              <w:right w:val="single" w:sz="4" w:space="0" w:color="D9D9D2"/>
-            </w:tcBorders>
-            <w:shd w:color="auto" w:fill="CDD2B7" w:val="clear"/>
-          </w:tcPr>
-          <w:p>
-            <w:pPr>
-              <w:pStyle w:val="Normal"/>
-              <w:keepNext w:val="true"/>
+              <w:left w:val="single" w:sz="4" w:space="0" w:color="8A8A8A"/>
+              <w:bottom w:val="single" w:sz="4" w:space="0" w:color="D9D9D2"/>
+              <w:right w:val="single" w:sz="4" w:space="0" w:color="D9D9D2"/>
+            </w:tcBorders>
+            <w:shd w:color="auto" w:fill="E6E6E2" w:val="clear"/>
+          </w:tcPr>
+          <w:p>
+            <w:pPr>
+              <w:pStyle w:val="Normal"/>
               <w:spacing w:lineRule="auto" w:line="252" w:before="0" w:after="0"/>
               <w:rPr/>
             </w:pPr>
@@ -894,7 +875,7 @@
                 <w:rFonts w:cs="Arial"/>
                 <w:b/>
                 <w:i w:val="false"/>
-                <w:color w:val="002516"/>
+                <w:color w:val="222222"/>
                 <w:sz w:val="17"/>
               </w:rPr>
               <w:t>COGCON Level 1 and Level 2</w:t>
@@ -914,7 +895,6 @@
           <w:p>
             <w:pPr>
               <w:pStyle w:val="Normal"/>
-              <w:keepNext w:val="true"/>
               <w:spacing w:lineRule="auto" w:line="252" w:before="0" w:after="0"/>
               <w:rPr/>
             </w:pPr>
@@ -936,13 +916,12 @@
               <w:top w:val="single" w:sz="4" w:space="0" w:color="D9D9D2"/>
               <w:left w:val="single" w:sz="4" w:space="0" w:color="D9D9D2"/>
               <w:bottom w:val="single" w:sz="4" w:space="0" w:color="D9D9D2"/>
-              <w:right w:val="single" w:sz="4" w:space="0" w:color="A89662"/>
-            </w:tcBorders>
-          </w:tcPr>
-          <w:p>
-            <w:pPr>
-              <w:pStyle w:val="Normal"/>
-              <w:keepNext w:val="true"/>
+              <w:right w:val="single" w:sz="4" w:space="0" w:color="8A8A8A"/>
+            </w:tcBorders>
+          </w:tcPr>
+          <w:p>
+            <w:pPr>
+              <w:pStyle w:val="Normal"/>
               <w:spacing w:lineRule="auto" w:line="252" w:before="0" w:after="0"/>
               <w:rPr/>
             </w:pPr>
@@ -967,11 +946,11 @@
             <w:tcW w:w="2040" w:type="dxa"/>
             <w:tcBorders>
               <w:top w:val="single" w:sz="4" w:space="0" w:color="D9D9D2"/>
-              <w:left w:val="single" w:sz="4" w:space="0" w:color="A89662"/>
-              <w:bottom w:val="single" w:sz="4" w:space="0" w:color="A89662"/>
-              <w:right w:val="single" w:sz="4" w:space="0" w:color="D9D9D2"/>
-            </w:tcBorders>
-            <w:shd w:color="auto" w:fill="CDD2B7" w:val="clear"/>
+              <w:left w:val="single" w:sz="4" w:space="0" w:color="8A8A8A"/>
+              <w:bottom w:val="single" w:sz="4" w:space="0" w:color="8A8A8A"/>
+              <w:right w:val="single" w:sz="4" w:space="0" w:color="D9D9D2"/>
+            </w:tcBorders>
+            <w:shd w:color="auto" w:fill="E6E6E2" w:val="clear"/>
           </w:tcPr>
           <w:p>
             <w:pPr>
@@ -984,7 +963,7 @@
                 <w:rFonts w:cs="Arial"/>
                 <w:b/>
                 <w:i w:val="false"/>
-                <w:color w:val="002516"/>
+                <w:color w:val="222222"/>
                 <w:sz w:val="17"/>
               </w:rPr>
               <w:t>Master COGCON Doctrine</w:t>
@@ -997,7 +976,7 @@
             <w:tcBorders>
               <w:top w:val="single" w:sz="4" w:space="0" w:color="D9D9D2"/>
               <w:left w:val="single" w:sz="4" w:space="0" w:color="D9D9D2"/>
-              <w:bottom w:val="single" w:sz="4" w:space="0" w:color="A89662"/>
+              <w:bottom w:val="single" w:sz="4" w:space="0" w:color="8A8A8A"/>
               <w:right w:val="single" w:sz="4" w:space="0" w:color="D9D9D2"/>
             </w:tcBorders>
           </w:tcPr>
@@ -1024,8 +1003,8 @@
             <w:tcBorders>
               <w:top w:val="single" w:sz="4" w:space="0" w:color="D9D9D2"/>
               <w:left w:val="single" w:sz="4" w:space="0" w:color="D9D9D2"/>
-              <w:bottom w:val="single" w:sz="4" w:space="0" w:color="A89662"/>
-              <w:right w:val="single" w:sz="4" w:space="0" w:color="A89662"/>
+              <w:bottom w:val="single" w:sz="4" w:space="0" w:color="8A8A8A"/>
+              <w:right w:val="single" w:sz="4" w:space="0" w:color="8A8A8A"/>
             </w:tcBorders>
           </w:tcPr>
           <w:p>
@@ -1099,7 +1078,7 @@
           <w:rFonts w:cs="Arial"/>
           <w:b/>
           <w:i w:val="false"/>
-          <w:color w:val="002516"/>
+          <w:color w:val="222222"/>
           <w:sz w:val="25"/>
         </w:rPr>
         <w:t>1. Combat Mindset Training Pillars</w:t>
@@ -1147,12 +1126,12 @@
           <w:tcPr>
             <w:tcW w:w="2608" w:type="dxa"/>
             <w:tcBorders>
-              <w:top w:val="single" w:sz="4" w:space="0" w:color="A89662"/>
-              <w:left w:val="single" w:sz="4" w:space="0" w:color="A89662"/>
-              <w:bottom w:val="single" w:sz="4" w:space="0" w:color="D9D9D2"/>
-              <w:right w:val="single" w:sz="4" w:space="0" w:color="D9D9D2"/>
-            </w:tcBorders>
-            <w:shd w:color="auto" w:fill="002516" w:val="clear"/>
+              <w:top w:val="single" w:sz="4" w:space="0" w:color="8A8A8A"/>
+              <w:left w:val="single" w:sz="4" w:space="0" w:color="8A8A8A"/>
+              <w:bottom w:val="single" w:sz="4" w:space="0" w:color="D9D9D2"/>
+              <w:right w:val="single" w:sz="4" w:space="0" w:color="D9D9D2"/>
+            </w:tcBorders>
+            <w:shd w:color="auto" w:fill="222222" w:val="clear"/>
           </w:tcPr>
           <w:p>
             <w:pPr>
@@ -1177,12 +1156,12 @@
           <w:tcPr>
             <w:tcW w:w="6689" w:type="dxa"/>
             <w:tcBorders>
-              <w:top w:val="single" w:sz="4" w:space="0" w:color="A89662"/>
-              <w:left w:val="single" w:sz="4" w:space="0" w:color="D9D9D2"/>
-              <w:bottom w:val="single" w:sz="4" w:space="0" w:color="D9D9D2"/>
-              <w:right w:val="single" w:sz="4" w:space="0" w:color="A89662"/>
-            </w:tcBorders>
-            <w:shd w:color="auto" w:fill="002516" w:val="clear"/>
+              <w:top w:val="single" w:sz="4" w:space="0" w:color="8A8A8A"/>
+              <w:left w:val="single" w:sz="4" w:space="0" w:color="D9D9D2"/>
+              <w:bottom w:val="single" w:sz="4" w:space="0" w:color="D9D9D2"/>
+              <w:right w:val="single" w:sz="4" w:space="0" w:color="8A8A8A"/>
+            </w:tcBorders>
+            <w:shd w:color="auto" w:fill="222222" w:val="clear"/>
           </w:tcPr>
           <w:p>
             <w:pPr>
@@ -1213,11 +1192,11 @@
             <w:tcW w:w="2608" w:type="dxa"/>
             <w:tcBorders>
               <w:top w:val="single" w:sz="4" w:space="0" w:color="D9D9D2"/>
-              <w:left w:val="single" w:sz="4" w:space="0" w:color="A89662"/>
-              <w:bottom w:val="single" w:sz="4" w:space="0" w:color="D9D9D2"/>
-              <w:right w:val="single" w:sz="4" w:space="0" w:color="D9D9D2"/>
-            </w:tcBorders>
-            <w:shd w:color="auto" w:fill="CDD2B7" w:val="clear"/>
+              <w:left w:val="single" w:sz="4" w:space="0" w:color="8A8A8A"/>
+              <w:bottom w:val="single" w:sz="4" w:space="0" w:color="D9D9D2"/>
+              <w:right w:val="single" w:sz="4" w:space="0" w:color="D9D9D2"/>
+            </w:tcBorders>
+            <w:shd w:color="auto" w:fill="E6E6E2" w:val="clear"/>
           </w:tcPr>
           <w:p>
             <w:pPr>
@@ -1231,7 +1210,7 @@
                 <w:rFonts w:cs="Arial"/>
                 <w:b/>
                 <w:i w:val="false"/>
-                <w:color w:val="002516"/>
+                <w:color w:val="222222"/>
                 <w:sz w:val="17"/>
               </w:rPr>
               <w:t>Self-Awareness</w:t>
@@ -1245,7 +1224,7 @@
               <w:top w:val="single" w:sz="4" w:space="0" w:color="D9D9D2"/>
               <w:left w:val="single" w:sz="4" w:space="0" w:color="D9D9D2"/>
               <w:bottom w:val="single" w:sz="4" w:space="0" w:color="D9D9D2"/>
-              <w:right w:val="single" w:sz="4" w:space="0" w:color="A89662"/>
+              <w:right w:val="single" w:sz="4" w:space="0" w:color="8A8A8A"/>
             </w:tcBorders>
           </w:tcPr>
           <w:p>
@@ -1276,11 +1255,11 @@
             <w:tcW w:w="2608" w:type="dxa"/>
             <w:tcBorders>
               <w:top w:val="single" w:sz="4" w:space="0" w:color="D9D9D2"/>
-              <w:left w:val="single" w:sz="4" w:space="0" w:color="A89662"/>
-              <w:bottom w:val="single" w:sz="4" w:space="0" w:color="D9D9D2"/>
-              <w:right w:val="single" w:sz="4" w:space="0" w:color="D9D9D2"/>
-            </w:tcBorders>
-            <w:shd w:color="auto" w:fill="CDD2B7" w:val="clear"/>
+              <w:left w:val="single" w:sz="4" w:space="0" w:color="8A8A8A"/>
+              <w:bottom w:val="single" w:sz="4" w:space="0" w:color="D9D9D2"/>
+              <w:right w:val="single" w:sz="4" w:space="0" w:color="D9D9D2"/>
+            </w:tcBorders>
+            <w:shd w:color="auto" w:fill="E6E6E2" w:val="clear"/>
           </w:tcPr>
           <w:p>
             <w:pPr>
@@ -1294,7 +1273,7 @@
                 <w:rFonts w:cs="Arial"/>
                 <w:b/>
                 <w:i w:val="false"/>
-                <w:color w:val="002516"/>
+                <w:color w:val="222222"/>
                 <w:sz w:val="17"/>
               </w:rPr>
               <w:t>Arousal Control</w:t>
@@ -1308,7 +1287,7 @@
               <w:top w:val="single" w:sz="4" w:space="0" w:color="D9D9D2"/>
               <w:left w:val="single" w:sz="4" w:space="0" w:color="D9D9D2"/>
               <w:bottom w:val="single" w:sz="4" w:space="0" w:color="D9D9D2"/>
-              <w:right w:val="single" w:sz="4" w:space="0" w:color="A89662"/>
+              <w:right w:val="single" w:sz="4" w:space="0" w:color="8A8A8A"/>
             </w:tcBorders>
           </w:tcPr>
           <w:p>
@@ -1339,11 +1318,11 @@
             <w:tcW w:w="2608" w:type="dxa"/>
             <w:tcBorders>
               <w:top w:val="single" w:sz="4" w:space="0" w:color="D9D9D2"/>
-              <w:left w:val="single" w:sz="4" w:space="0" w:color="A89662"/>
-              <w:bottom w:val="single" w:sz="4" w:space="0" w:color="D9D9D2"/>
-              <w:right w:val="single" w:sz="4" w:space="0" w:color="D9D9D2"/>
-            </w:tcBorders>
-            <w:shd w:color="auto" w:fill="CDD2B7" w:val="clear"/>
+              <w:left w:val="single" w:sz="4" w:space="0" w:color="8A8A8A"/>
+              <w:bottom w:val="single" w:sz="4" w:space="0" w:color="D9D9D2"/>
+              <w:right w:val="single" w:sz="4" w:space="0" w:color="D9D9D2"/>
+            </w:tcBorders>
+            <w:shd w:color="auto" w:fill="E6E6E2" w:val="clear"/>
           </w:tcPr>
           <w:p>
             <w:pPr>
@@ -1357,7 +1336,7 @@
                 <w:rFonts w:cs="Arial"/>
                 <w:b/>
                 <w:i w:val="false"/>
-                <w:color w:val="002516"/>
+                <w:color w:val="222222"/>
                 <w:sz w:val="17"/>
               </w:rPr>
               <w:t>Operational Habit</w:t>
@@ -1371,7 +1350,7 @@
               <w:top w:val="single" w:sz="4" w:space="0" w:color="D9D9D2"/>
               <w:left w:val="single" w:sz="4" w:space="0" w:color="D9D9D2"/>
               <w:bottom w:val="single" w:sz="4" w:space="0" w:color="D9D9D2"/>
-              <w:right w:val="single" w:sz="4" w:space="0" w:color="A89662"/>
+              <w:right w:val="single" w:sz="4" w:space="0" w:color="8A8A8A"/>
             </w:tcBorders>
           </w:tcPr>
           <w:p>
@@ -1402,11 +1381,11 @@
             <w:tcW w:w="2608" w:type="dxa"/>
             <w:tcBorders>
               <w:top w:val="single" w:sz="4" w:space="0" w:color="D9D9D2"/>
-              <w:left w:val="single" w:sz="4" w:space="0" w:color="A89662"/>
-              <w:bottom w:val="single" w:sz="4" w:space="0" w:color="D9D9D2"/>
-              <w:right w:val="single" w:sz="4" w:space="0" w:color="D9D9D2"/>
-            </w:tcBorders>
-            <w:shd w:color="auto" w:fill="CDD2B7" w:val="clear"/>
+              <w:left w:val="single" w:sz="4" w:space="0" w:color="8A8A8A"/>
+              <w:bottom w:val="single" w:sz="4" w:space="0" w:color="D9D9D2"/>
+              <w:right w:val="single" w:sz="4" w:space="0" w:color="D9D9D2"/>
+            </w:tcBorders>
+            <w:shd w:color="auto" w:fill="E6E6E2" w:val="clear"/>
           </w:tcPr>
           <w:p>
             <w:pPr>
@@ -1420,7 +1399,7 @@
                 <w:rFonts w:cs="Arial"/>
                 <w:b/>
                 <w:i w:val="false"/>
-                <w:color w:val="002516"/>
+                <w:color w:val="222222"/>
                 <w:sz w:val="17"/>
               </w:rPr>
               <w:t>Working Memory</w:t>
@@ -1434,7 +1413,7 @@
               <w:top w:val="single" w:sz="4" w:space="0" w:color="D9D9D2"/>
               <w:left w:val="single" w:sz="4" w:space="0" w:color="D9D9D2"/>
               <w:bottom w:val="single" w:sz="4" w:space="0" w:color="D9D9D2"/>
-              <w:right w:val="single" w:sz="4" w:space="0" w:color="A89662"/>
+              <w:right w:val="single" w:sz="4" w:space="0" w:color="8A8A8A"/>
             </w:tcBorders>
           </w:tcPr>
           <w:p>
@@ -1465,11 +1444,11 @@
             <w:tcW w:w="2608" w:type="dxa"/>
             <w:tcBorders>
               <w:top w:val="single" w:sz="4" w:space="0" w:color="D9D9D2"/>
-              <w:left w:val="single" w:sz="4" w:space="0" w:color="A89662"/>
-              <w:bottom w:val="single" w:sz="4" w:space="0" w:color="D9D9D2"/>
-              <w:right w:val="single" w:sz="4" w:space="0" w:color="D9D9D2"/>
-            </w:tcBorders>
-            <w:shd w:color="auto" w:fill="CDD2B7" w:val="clear"/>
+              <w:left w:val="single" w:sz="4" w:space="0" w:color="8A8A8A"/>
+              <w:bottom w:val="single" w:sz="4" w:space="0" w:color="D9D9D2"/>
+              <w:right w:val="single" w:sz="4" w:space="0" w:color="D9D9D2"/>
+            </w:tcBorders>
+            <w:shd w:color="auto" w:fill="E6E6E2" w:val="clear"/>
           </w:tcPr>
           <w:p>
             <w:pPr>
@@ -1483,7 +1462,7 @@
                 <w:rFonts w:cs="Arial"/>
                 <w:b/>
                 <w:i w:val="false"/>
-                <w:color w:val="002516"/>
+                <w:color w:val="222222"/>
                 <w:sz w:val="17"/>
               </w:rPr>
               <w:t>Attentional Control</w:t>
@@ -1497,7 +1476,7 @@
               <w:top w:val="single" w:sz="4" w:space="0" w:color="D9D9D2"/>
               <w:left w:val="single" w:sz="4" w:space="0" w:color="D9D9D2"/>
               <w:bottom w:val="single" w:sz="4" w:space="0" w:color="D9D9D2"/>
-              <w:right w:val="single" w:sz="4" w:space="0" w:color="A89662"/>
+              <w:right w:val="single" w:sz="4" w:space="0" w:color="8A8A8A"/>
             </w:tcBorders>
           </w:tcPr>
           <w:p>
@@ -1528,11 +1507,11 @@
             <w:tcW w:w="2608" w:type="dxa"/>
             <w:tcBorders>
               <w:top w:val="single" w:sz="4" w:space="0" w:color="D9D9D2"/>
-              <w:left w:val="single" w:sz="4" w:space="0" w:color="A89662"/>
-              <w:bottom w:val="single" w:sz="4" w:space="0" w:color="A89662"/>
-              <w:right w:val="single" w:sz="4" w:space="0" w:color="D9D9D2"/>
-            </w:tcBorders>
-            <w:shd w:color="auto" w:fill="CDD2B7" w:val="clear"/>
+              <w:left w:val="single" w:sz="4" w:space="0" w:color="8A8A8A"/>
+              <w:bottom w:val="single" w:sz="4" w:space="0" w:color="8A8A8A"/>
+              <w:right w:val="single" w:sz="4" w:space="0" w:color="D9D9D2"/>
+            </w:tcBorders>
+            <w:shd w:color="auto" w:fill="E6E6E2" w:val="clear"/>
           </w:tcPr>
           <w:p>
             <w:pPr>
@@ -1545,7 +1524,7 @@
                 <w:rFonts w:cs="Arial"/>
                 <w:b/>
                 <w:i w:val="false"/>
-                <w:color w:val="002516"/>
+                <w:color w:val="222222"/>
                 <w:sz w:val="17"/>
               </w:rPr>
               <w:t>Cognitive Control</w:t>
@@ -1558,8 +1537,8 @@
             <w:tcBorders>
               <w:top w:val="single" w:sz="4" w:space="0" w:color="D9D9D2"/>
               <w:left w:val="single" w:sz="4" w:space="0" w:color="D9D9D2"/>
-              <w:bottom w:val="single" w:sz="4" w:space="0" w:color="A89662"/>
-              <w:right w:val="single" w:sz="4" w:space="0" w:color="A89662"/>
+              <w:bottom w:val="single" w:sz="4" w:space="0" w:color="8A8A8A"/>
+              <w:right w:val="single" w:sz="4" w:space="0" w:color="8A8A8A"/>
             </w:tcBorders>
           </w:tcPr>
           <w:p>
@@ -1621,7 +1600,7 @@
         <w:rPr>
           <w:rFonts w:cs="Arial"/>
           <w:b/>
-          <w:color w:val="002516"/>
+          <w:color w:val="222222"/>
         </w:rPr>
         <w:t>•</w:t>
       </w:r>
@@ -1629,7 +1608,7 @@
         <w:rPr>
           <w:rFonts w:cs="Arial"/>
           <w:b/>
-          <w:color w:val="002516"/>
+          <w:color w:val="222222"/>
         </w:rPr>
         <w:tab/>
       </w:r>
@@ -1661,7 +1640,7 @@
           <w:rFonts w:cs="Arial"/>
           <w:b/>
           <w:i w:val="false"/>
-          <w:color w:val="002516"/>
+          <w:color w:val="222222"/>
           <w:sz w:val="25"/>
         </w:rPr>
         <w:t>2. Combat Mindset Reset</w:t>
@@ -1673,7 +1652,7 @@
         <w:pBdr>
           <w:left w:val="single" w:sz="28" w:space="8" w:color="C62026"/>
         </w:pBdr>
-        <w:shd w:val="clear" w:color="auto" w:fill="CDD2B7"/>
+        <w:shd w:val="clear" w:color="auto" w:fill="E6E6E2"/>
         <w:spacing w:before="160" w:after="160"/>
         <w:ind w:left="283" w:right="283"/>
         <w:rPr/>
@@ -1748,7 +1727,7 @@
         <w:rPr>
           <w:rFonts w:cs="Arial"/>
           <w:b/>
-          <w:color w:val="002516"/>
+          <w:color w:val="222222"/>
         </w:rPr>
         <w:t>•</w:t>
       </w:r>
@@ -1756,7 +1735,7 @@
         <w:rPr>
           <w:rFonts w:cs="Arial"/>
           <w:b/>
-          <w:color w:val="002516"/>
+          <w:color w:val="222222"/>
         </w:rPr>
         <w:tab/>
       </w:r>
@@ -1788,7 +1767,7 @@
           <w:rFonts w:cs="Arial"/>
           <w:b/>
           <w:i w:val="false"/>
-          <w:color w:val="002516"/>
+          <w:color w:val="222222"/>
           <w:sz w:val="25"/>
         </w:rPr>
         <w:t>3. Combat Mindset Performance States</w:t>
@@ -1837,12 +1816,12 @@
           <w:tcPr>
             <w:tcW w:w="2040" w:type="dxa"/>
             <w:tcBorders>
-              <w:top w:val="single" w:sz="4" w:space="0" w:color="A89662"/>
-              <w:left w:val="single" w:sz="4" w:space="0" w:color="A89662"/>
-              <w:bottom w:val="single" w:sz="4" w:space="0" w:color="D9D9D2"/>
-              <w:right w:val="single" w:sz="4" w:space="0" w:color="D9D9D2"/>
-            </w:tcBorders>
-            <w:shd w:color="auto" w:fill="002516" w:val="clear"/>
+              <w:top w:val="single" w:sz="4" w:space="0" w:color="8A8A8A"/>
+              <w:left w:val="single" w:sz="4" w:space="0" w:color="8A8A8A"/>
+              <w:bottom w:val="single" w:sz="4" w:space="0" w:color="D9D9D2"/>
+              <w:right w:val="single" w:sz="4" w:space="0" w:color="D9D9D2"/>
+            </w:tcBorders>
+            <w:shd w:color="auto" w:fill="222222" w:val="clear"/>
           </w:tcPr>
           <w:p>
             <w:pPr>
@@ -1867,12 +1846,12 @@
           <w:tcPr>
             <w:tcW w:w="3629" w:type="dxa"/>
             <w:tcBorders>
-              <w:top w:val="single" w:sz="4" w:space="0" w:color="A89662"/>
-              <w:left w:val="single" w:sz="4" w:space="0" w:color="D9D9D2"/>
-              <w:bottom w:val="single" w:sz="4" w:space="0" w:color="D9D9D2"/>
-              <w:right w:val="single" w:sz="4" w:space="0" w:color="D9D9D2"/>
-            </w:tcBorders>
-            <w:shd w:color="auto" w:fill="002516" w:val="clear"/>
+              <w:top w:val="single" w:sz="4" w:space="0" w:color="8A8A8A"/>
+              <w:left w:val="single" w:sz="4" w:space="0" w:color="D9D9D2"/>
+              <w:bottom w:val="single" w:sz="4" w:space="0" w:color="D9D9D2"/>
+              <w:right w:val="single" w:sz="4" w:space="0" w:color="D9D9D2"/>
+            </w:tcBorders>
+            <w:shd w:color="auto" w:fill="222222" w:val="clear"/>
           </w:tcPr>
           <w:p>
             <w:pPr>
@@ -1897,12 +1876,12 @@
           <w:tcPr>
             <w:tcW w:w="3628" w:type="dxa"/>
             <w:tcBorders>
-              <w:top w:val="single" w:sz="4" w:space="0" w:color="A89662"/>
-              <w:left w:val="single" w:sz="4" w:space="0" w:color="D9D9D2"/>
-              <w:bottom w:val="single" w:sz="4" w:space="0" w:color="D9D9D2"/>
-              <w:right w:val="single" w:sz="4" w:space="0" w:color="A89662"/>
-            </w:tcBorders>
-            <w:shd w:color="auto" w:fill="002516" w:val="clear"/>
+              <w:top w:val="single" w:sz="4" w:space="0" w:color="8A8A8A"/>
+              <w:left w:val="single" w:sz="4" w:space="0" w:color="D9D9D2"/>
+              <w:bottom w:val="single" w:sz="4" w:space="0" w:color="D9D9D2"/>
+              <w:right w:val="single" w:sz="4" w:space="0" w:color="8A8A8A"/>
+            </w:tcBorders>
+            <w:shd w:color="auto" w:fill="222222" w:val="clear"/>
           </w:tcPr>
           <w:p>
             <w:pPr>
@@ -1933,11 +1912,11 @@
             <w:tcW w:w="2040" w:type="dxa"/>
             <w:tcBorders>
               <w:top w:val="single" w:sz="4" w:space="0" w:color="D9D9D2"/>
-              <w:left w:val="single" w:sz="4" w:space="0" w:color="A89662"/>
-              <w:bottom w:val="single" w:sz="4" w:space="0" w:color="D9D9D2"/>
-              <w:right w:val="single" w:sz="4" w:space="0" w:color="D9D9D2"/>
-            </w:tcBorders>
-            <w:shd w:color="auto" w:fill="CDD2B7" w:val="clear"/>
+              <w:left w:val="single" w:sz="4" w:space="0" w:color="8A8A8A"/>
+              <w:bottom w:val="single" w:sz="4" w:space="0" w:color="D9D9D2"/>
+              <w:right w:val="single" w:sz="4" w:space="0" w:color="D9D9D2"/>
+            </w:tcBorders>
+            <w:shd w:color="auto" w:fill="E6E6E2" w:val="clear"/>
           </w:tcPr>
           <w:p>
             <w:pPr>
@@ -1951,7 +1930,7 @@
                 <w:rFonts w:cs="Arial"/>
                 <w:b/>
                 <w:i w:val="false"/>
-                <w:color w:val="002516"/>
+                <w:color w:val="222222"/>
                 <w:sz w:val="17"/>
               </w:rPr>
               <w:t>Task Focus</w:t>
@@ -1993,7 +1972,7 @@
               <w:top w:val="single" w:sz="4" w:space="0" w:color="D9D9D2"/>
               <w:left w:val="single" w:sz="4" w:space="0" w:color="D9D9D2"/>
               <w:bottom w:val="single" w:sz="4" w:space="0" w:color="D9D9D2"/>
-              <w:right w:val="single" w:sz="4" w:space="0" w:color="A89662"/>
+              <w:right w:val="single" w:sz="4" w:space="0" w:color="8A8A8A"/>
             </w:tcBorders>
           </w:tcPr>
           <w:p>
@@ -2024,11 +2003,11 @@
             <w:tcW w:w="2040" w:type="dxa"/>
             <w:tcBorders>
               <w:top w:val="single" w:sz="4" w:space="0" w:color="D9D9D2"/>
-              <w:left w:val="single" w:sz="4" w:space="0" w:color="A89662"/>
-              <w:bottom w:val="single" w:sz="4" w:space="0" w:color="D9D9D2"/>
-              <w:right w:val="single" w:sz="4" w:space="0" w:color="D9D9D2"/>
-            </w:tcBorders>
-            <w:shd w:color="auto" w:fill="CDD2B7" w:val="clear"/>
+              <w:left w:val="single" w:sz="4" w:space="0" w:color="8A8A8A"/>
+              <w:bottom w:val="single" w:sz="4" w:space="0" w:color="D9D9D2"/>
+              <w:right w:val="single" w:sz="4" w:space="0" w:color="D9D9D2"/>
+            </w:tcBorders>
+            <w:shd w:color="auto" w:fill="E6E6E2" w:val="clear"/>
           </w:tcPr>
           <w:p>
             <w:pPr>
@@ -2042,7 +2021,7 @@
                 <w:rFonts w:cs="Arial"/>
                 <w:b/>
                 <w:i w:val="false"/>
-                <w:color w:val="002516"/>
+                <w:color w:val="222222"/>
                 <w:sz w:val="17"/>
               </w:rPr>
               <w:t>Command Presence</w:t>
@@ -2084,7 +2063,7 @@
               <w:top w:val="single" w:sz="4" w:space="0" w:color="D9D9D2"/>
               <w:left w:val="single" w:sz="4" w:space="0" w:color="D9D9D2"/>
               <w:bottom w:val="single" w:sz="4" w:space="0" w:color="D9D9D2"/>
-              <w:right w:val="single" w:sz="4" w:space="0" w:color="A89662"/>
+              <w:right w:val="single" w:sz="4" w:space="0" w:color="8A8A8A"/>
             </w:tcBorders>
           </w:tcPr>
           <w:p>
@@ -2115,11 +2094,11 @@
             <w:tcW w:w="2040" w:type="dxa"/>
             <w:tcBorders>
               <w:top w:val="single" w:sz="4" w:space="0" w:color="D9D9D2"/>
-              <w:left w:val="single" w:sz="4" w:space="0" w:color="A89662"/>
-              <w:bottom w:val="single" w:sz="4" w:space="0" w:color="D9D9D2"/>
-              <w:right w:val="single" w:sz="4" w:space="0" w:color="D9D9D2"/>
-            </w:tcBorders>
-            <w:shd w:color="auto" w:fill="CDD2B7" w:val="clear"/>
+              <w:left w:val="single" w:sz="4" w:space="0" w:color="8A8A8A"/>
+              <w:bottom w:val="single" w:sz="4" w:space="0" w:color="D9D9D2"/>
+              <w:right w:val="single" w:sz="4" w:space="0" w:color="D9D9D2"/>
+            </w:tcBorders>
+            <w:shd w:color="auto" w:fill="E6E6E2" w:val="clear"/>
           </w:tcPr>
           <w:p>
             <w:pPr>
@@ -2133,7 +2112,7 @@
                 <w:rFonts w:cs="Arial"/>
                 <w:b/>
                 <w:i w:val="false"/>
-                <w:color w:val="002516"/>
+                <w:color w:val="222222"/>
                 <w:sz w:val="17"/>
               </w:rPr>
               <w:t>Situational Awareness</w:t>
@@ -2175,7 +2154,7 @@
               <w:top w:val="single" w:sz="4" w:space="0" w:color="D9D9D2"/>
               <w:left w:val="single" w:sz="4" w:space="0" w:color="D9D9D2"/>
               <w:bottom w:val="single" w:sz="4" w:space="0" w:color="D9D9D2"/>
-              <w:right w:val="single" w:sz="4" w:space="0" w:color="A89662"/>
+              <w:right w:val="single" w:sz="4" w:space="0" w:color="8A8A8A"/>
             </w:tcBorders>
           </w:tcPr>
           <w:p>
@@ -2206,11 +2185,11 @@
             <w:tcW w:w="2040" w:type="dxa"/>
             <w:tcBorders>
               <w:top w:val="single" w:sz="4" w:space="0" w:color="D9D9D2"/>
-              <w:left w:val="single" w:sz="4" w:space="0" w:color="A89662"/>
-              <w:bottom w:val="single" w:sz="4" w:space="0" w:color="A89662"/>
-              <w:right w:val="single" w:sz="4" w:space="0" w:color="D9D9D2"/>
-            </w:tcBorders>
-            <w:shd w:color="auto" w:fill="CDD2B7" w:val="clear"/>
+              <w:left w:val="single" w:sz="4" w:space="0" w:color="8A8A8A"/>
+              <w:bottom w:val="single" w:sz="4" w:space="0" w:color="8A8A8A"/>
+              <w:right w:val="single" w:sz="4" w:space="0" w:color="D9D9D2"/>
+            </w:tcBorders>
+            <w:shd w:color="auto" w:fill="E6E6E2" w:val="clear"/>
           </w:tcPr>
           <w:p>
             <w:pPr>
@@ -2223,7 +2202,7 @@
                 <w:rFonts w:cs="Arial"/>
                 <w:b/>
                 <w:i w:val="false"/>
-                <w:color w:val="002516"/>
+                <w:color w:val="222222"/>
                 <w:sz w:val="17"/>
               </w:rPr>
               <w:t>Resilience</w:t>
@@ -2236,7 +2215,7 @@
             <w:tcBorders>
               <w:top w:val="single" w:sz="4" w:space="0" w:color="D9D9D2"/>
               <w:left w:val="single" w:sz="4" w:space="0" w:color="D9D9D2"/>
-              <w:bottom w:val="single" w:sz="4" w:space="0" w:color="A89662"/>
+              <w:bottom w:val="single" w:sz="4" w:space="0" w:color="8A8A8A"/>
               <w:right w:val="single" w:sz="4" w:space="0" w:color="D9D9D2"/>
             </w:tcBorders>
           </w:tcPr>
@@ -2263,8 +2242,8 @@
             <w:tcBorders>
               <w:top w:val="single" w:sz="4" w:space="0" w:color="D9D9D2"/>
               <w:left w:val="single" w:sz="4" w:space="0" w:color="D9D9D2"/>
-              <w:bottom w:val="single" w:sz="4" w:space="0" w:color="A89662"/>
-              <w:right w:val="single" w:sz="4" w:space="0" w:color="A89662"/>
+              <w:bottom w:val="single" w:sz="4" w:space="0" w:color="8A8A8A"/>
+              <w:right w:val="single" w:sz="4" w:space="0" w:color="8A8A8A"/>
             </w:tcBorders>
           </w:tcPr>
           <w:p>
@@ -2326,7 +2305,7 @@
         <w:rPr>
           <w:rFonts w:cs="Arial"/>
           <w:b/>
-          <w:color w:val="002516"/>
+          <w:color w:val="222222"/>
         </w:rPr>
         <w:t>•</w:t>
       </w:r>
@@ -2334,7 +2313,7 @@
         <w:rPr>
           <w:rFonts w:cs="Arial"/>
           <w:b/>
-          <w:color w:val="002516"/>
+          <w:color w:val="222222"/>
         </w:rPr>
         <w:tab/>
       </w:r>
@@ -2366,7 +2345,7 @@
           <w:rFonts w:cs="Arial"/>
           <w:b/>
           <w:i w:val="false"/>
-          <w:color w:val="002516"/>
+          <w:color w:val="222222"/>
           <w:sz w:val="25"/>
         </w:rPr>
         <w:t>4. CMC Training Methodology</w:t>
@@ -2436,7 +2415,7 @@
           <w:rFonts w:cs="Arial"/>
           <w:b/>
           <w:i w:val="false"/>
-          <w:color w:val="002516"/>
+          <w:color w:val="222222"/>
           <w:sz w:val="25"/>
         </w:rPr>
         <w:t>5. CMC Coaching and Assurance</w:t>
@@ -2549,7 +2528,7 @@
         <w:rPr>
           <w:rFonts w:cs="Arial"/>
           <w:b/>
-          <w:color w:val="002516"/>
+          <w:color w:val="222222"/>
         </w:rPr>
         <w:t>•</w:t>
       </w:r>
@@ -2557,7 +2536,7 @@
         <w:rPr>
           <w:rFonts w:cs="Arial"/>
           <w:b/>
-          <w:color w:val="002516"/>
+          <w:color w:val="222222"/>
         </w:rPr>
         <w:tab/>
       </w:r>
@@ -2589,7 +2568,7 @@
           <w:rFonts w:cs="Arial"/>
           <w:b/>
           <w:i w:val="false"/>
-          <w:color w:val="002516"/>
+          <w:color w:val="222222"/>
           <w:sz w:val="25"/>
         </w:rPr>
         <w:t>6. Progressive Development</w:t>
@@ -2638,12 +2617,12 @@
           <w:tcPr>
             <w:tcW w:w="2040" w:type="dxa"/>
             <w:tcBorders>
-              <w:top w:val="single" w:sz="4" w:space="0" w:color="A89662"/>
-              <w:left w:val="single" w:sz="4" w:space="0" w:color="A89662"/>
-              <w:bottom w:val="single" w:sz="4" w:space="0" w:color="D9D9D2"/>
-              <w:right w:val="single" w:sz="4" w:space="0" w:color="D9D9D2"/>
-            </w:tcBorders>
-            <w:shd w:color="auto" w:fill="002516" w:val="clear"/>
+              <w:top w:val="single" w:sz="4" w:space="0" w:color="8A8A8A"/>
+              <w:left w:val="single" w:sz="4" w:space="0" w:color="8A8A8A"/>
+              <w:bottom w:val="single" w:sz="4" w:space="0" w:color="D9D9D2"/>
+              <w:right w:val="single" w:sz="4" w:space="0" w:color="D9D9D2"/>
+            </w:tcBorders>
+            <w:shd w:color="auto" w:fill="222222" w:val="clear"/>
           </w:tcPr>
           <w:p>
             <w:pPr>
@@ -2668,12 +2647,12 @@
           <w:tcPr>
             <w:tcW w:w="3629" w:type="dxa"/>
             <w:tcBorders>
-              <w:top w:val="single" w:sz="4" w:space="0" w:color="A89662"/>
-              <w:left w:val="single" w:sz="4" w:space="0" w:color="D9D9D2"/>
-              <w:bottom w:val="single" w:sz="4" w:space="0" w:color="D9D9D2"/>
-              <w:right w:val="single" w:sz="4" w:space="0" w:color="D9D9D2"/>
-            </w:tcBorders>
-            <w:shd w:color="auto" w:fill="002516" w:val="clear"/>
+              <w:top w:val="single" w:sz="4" w:space="0" w:color="8A8A8A"/>
+              <w:left w:val="single" w:sz="4" w:space="0" w:color="D9D9D2"/>
+              <w:bottom w:val="single" w:sz="4" w:space="0" w:color="D9D9D2"/>
+              <w:right w:val="single" w:sz="4" w:space="0" w:color="D9D9D2"/>
+            </w:tcBorders>
+            <w:shd w:color="auto" w:fill="222222" w:val="clear"/>
           </w:tcPr>
           <w:p>
             <w:pPr>
@@ -2698,12 +2677,12 @@
           <w:tcPr>
             <w:tcW w:w="3628" w:type="dxa"/>
             <w:tcBorders>
-              <w:top w:val="single" w:sz="4" w:space="0" w:color="A89662"/>
-              <w:left w:val="single" w:sz="4" w:space="0" w:color="D9D9D2"/>
-              <w:bottom w:val="single" w:sz="4" w:space="0" w:color="D9D9D2"/>
-              <w:right w:val="single" w:sz="4" w:space="0" w:color="A89662"/>
-            </w:tcBorders>
-            <w:shd w:color="auto" w:fill="002516" w:val="clear"/>
+              <w:top w:val="single" w:sz="4" w:space="0" w:color="8A8A8A"/>
+              <w:left w:val="single" w:sz="4" w:space="0" w:color="D9D9D2"/>
+              <w:bottom w:val="single" w:sz="4" w:space="0" w:color="D9D9D2"/>
+              <w:right w:val="single" w:sz="4" w:space="0" w:color="8A8A8A"/>
+            </w:tcBorders>
+            <w:shd w:color="auto" w:fill="222222" w:val="clear"/>
           </w:tcPr>
           <w:p>
             <w:pPr>
@@ -2734,11 +2713,11 @@
             <w:tcW w:w="2040" w:type="dxa"/>
             <w:tcBorders>
               <w:top w:val="single" w:sz="4" w:space="0" w:color="D9D9D2"/>
-              <w:left w:val="single" w:sz="4" w:space="0" w:color="A89662"/>
-              <w:bottom w:val="single" w:sz="4" w:space="0" w:color="D9D9D2"/>
-              <w:right w:val="single" w:sz="4" w:space="0" w:color="D9D9D2"/>
-            </w:tcBorders>
-            <w:shd w:color="auto" w:fill="CDD2B7" w:val="clear"/>
+              <w:left w:val="single" w:sz="4" w:space="0" w:color="8A8A8A"/>
+              <w:bottom w:val="single" w:sz="4" w:space="0" w:color="D9D9D2"/>
+              <w:right w:val="single" w:sz="4" w:space="0" w:color="D9D9D2"/>
+            </w:tcBorders>
+            <w:shd w:color="auto" w:fill="E6E6E2" w:val="clear"/>
           </w:tcPr>
           <w:p>
             <w:pPr>
@@ -2752,7 +2731,7 @@
                 <w:rFonts w:cs="Arial"/>
                 <w:b/>
                 <w:i w:val="false"/>
-                <w:color w:val="002516"/>
+                <w:color w:val="222222"/>
                 <w:sz w:val="17"/>
               </w:rPr>
               <w:t>1. Understand Self</w:t>
@@ -2794,7 +2773,7 @@
               <w:top w:val="single" w:sz="4" w:space="0" w:color="D9D9D2"/>
               <w:left w:val="single" w:sz="4" w:space="0" w:color="D9D9D2"/>
               <w:bottom w:val="single" w:sz="4" w:space="0" w:color="D9D9D2"/>
-              <w:right w:val="single" w:sz="4" w:space="0" w:color="A89662"/>
+              <w:right w:val="single" w:sz="4" w:space="0" w:color="8A8A8A"/>
             </w:tcBorders>
           </w:tcPr>
           <w:p>
@@ -2825,11 +2804,11 @@
             <w:tcW w:w="2040" w:type="dxa"/>
             <w:tcBorders>
               <w:top w:val="single" w:sz="4" w:space="0" w:color="D9D9D2"/>
-              <w:left w:val="single" w:sz="4" w:space="0" w:color="A89662"/>
-              <w:bottom w:val="single" w:sz="4" w:space="0" w:color="D9D9D2"/>
-              <w:right w:val="single" w:sz="4" w:space="0" w:color="D9D9D2"/>
-            </w:tcBorders>
-            <w:shd w:color="auto" w:fill="CDD2B7" w:val="clear"/>
+              <w:left w:val="single" w:sz="4" w:space="0" w:color="8A8A8A"/>
+              <w:bottom w:val="single" w:sz="4" w:space="0" w:color="D9D9D2"/>
+              <w:right w:val="single" w:sz="4" w:space="0" w:color="D9D9D2"/>
+            </w:tcBorders>
+            <w:shd w:color="auto" w:fill="E6E6E2" w:val="clear"/>
           </w:tcPr>
           <w:p>
             <w:pPr>
@@ -2843,7 +2822,7 @@
                 <w:rFonts w:cs="Arial"/>
                 <w:b/>
                 <w:i w:val="false"/>
-                <w:color w:val="002516"/>
+                <w:color w:val="222222"/>
                 <w:sz w:val="17"/>
               </w:rPr>
               <w:t>2. Regulate Self</w:t>
@@ -2885,7 +2864,7 @@
               <w:top w:val="single" w:sz="4" w:space="0" w:color="D9D9D2"/>
               <w:left w:val="single" w:sz="4" w:space="0" w:color="D9D9D2"/>
               <w:bottom w:val="single" w:sz="4" w:space="0" w:color="D9D9D2"/>
-              <w:right w:val="single" w:sz="4" w:space="0" w:color="A89662"/>
+              <w:right w:val="single" w:sz="4" w:space="0" w:color="8A8A8A"/>
             </w:tcBorders>
           </w:tcPr>
           <w:p>
@@ -2916,11 +2895,11 @@
             <w:tcW w:w="2040" w:type="dxa"/>
             <w:tcBorders>
               <w:top w:val="single" w:sz="4" w:space="0" w:color="D9D9D2"/>
-              <w:left w:val="single" w:sz="4" w:space="0" w:color="A89662"/>
-              <w:bottom w:val="single" w:sz="4" w:space="0" w:color="D9D9D2"/>
-              <w:right w:val="single" w:sz="4" w:space="0" w:color="D9D9D2"/>
-            </w:tcBorders>
-            <w:shd w:color="auto" w:fill="CDD2B7" w:val="clear"/>
+              <w:left w:val="single" w:sz="4" w:space="0" w:color="8A8A8A"/>
+              <w:bottom w:val="single" w:sz="4" w:space="0" w:color="D9D9D2"/>
+              <w:right w:val="single" w:sz="4" w:space="0" w:color="D9D9D2"/>
+            </w:tcBorders>
+            <w:shd w:color="auto" w:fill="E6E6E2" w:val="clear"/>
           </w:tcPr>
           <w:p>
             <w:pPr>
@@ -2934,7 +2913,7 @@
                 <w:rFonts w:cs="Arial"/>
                 <w:b/>
                 <w:i w:val="false"/>
-                <w:color w:val="002516"/>
+                <w:color w:val="222222"/>
                 <w:sz w:val="17"/>
               </w:rPr>
               <w:t>3. Perform Under Pressure</w:t>
@@ -2976,7 +2955,7 @@
               <w:top w:val="single" w:sz="4" w:space="0" w:color="D9D9D2"/>
               <w:left w:val="single" w:sz="4" w:space="0" w:color="D9D9D2"/>
               <w:bottom w:val="single" w:sz="4" w:space="0" w:color="D9D9D2"/>
-              <w:right w:val="single" w:sz="4" w:space="0" w:color="A89662"/>
+              <w:right w:val="single" w:sz="4" w:space="0" w:color="8A8A8A"/>
             </w:tcBorders>
           </w:tcPr>
           <w:p>
@@ -3007,11 +2986,11 @@
             <w:tcW w:w="2040" w:type="dxa"/>
             <w:tcBorders>
               <w:top w:val="single" w:sz="4" w:space="0" w:color="D9D9D2"/>
-              <w:left w:val="single" w:sz="4" w:space="0" w:color="A89662"/>
-              <w:bottom w:val="single" w:sz="4" w:space="0" w:color="A89662"/>
-              <w:right w:val="single" w:sz="4" w:space="0" w:color="D9D9D2"/>
-            </w:tcBorders>
-            <w:shd w:color="auto" w:fill="CDD2B7" w:val="clear"/>
+              <w:left w:val="single" w:sz="4" w:space="0" w:color="8A8A8A"/>
+              <w:bottom w:val="single" w:sz="4" w:space="0" w:color="8A8A8A"/>
+              <w:right w:val="single" w:sz="4" w:space="0" w:color="D9D9D2"/>
+            </w:tcBorders>
+            <w:shd w:color="auto" w:fill="E6E6E2" w:val="clear"/>
           </w:tcPr>
           <w:p>
             <w:pPr>
@@ -3024,7 +3003,7 @@
                 <w:rFonts w:cs="Arial"/>
                 <w:b/>
                 <w:i w:val="false"/>
-                <w:color w:val="002516"/>
+                <w:color w:val="222222"/>
                 <w:sz w:val="17"/>
               </w:rPr>
               <w:t>4. Combat Mindset</w:t>
@@ -3037,7 +3016,7 @@
             <w:tcBorders>
               <w:top w:val="single" w:sz="4" w:space="0" w:color="D9D9D2"/>
               <w:left w:val="single" w:sz="4" w:space="0" w:color="D9D9D2"/>
-              <w:bottom w:val="single" w:sz="4" w:space="0" w:color="A89662"/>
+              <w:bottom w:val="single" w:sz="4" w:space="0" w:color="8A8A8A"/>
               <w:right w:val="single" w:sz="4" w:space="0" w:color="D9D9D2"/>
             </w:tcBorders>
           </w:tcPr>
@@ -3064,8 +3043,8 @@
             <w:tcBorders>
               <w:top w:val="single" w:sz="4" w:space="0" w:color="D9D9D2"/>
               <w:left w:val="single" w:sz="4" w:space="0" w:color="D9D9D2"/>
-              <w:bottom w:val="single" w:sz="4" w:space="0" w:color="A89662"/>
-              <w:right w:val="single" w:sz="4" w:space="0" w:color="A89662"/>
+              <w:bottom w:val="single" w:sz="4" w:space="0" w:color="8A8A8A"/>
+              <w:right w:val="single" w:sz="4" w:space="0" w:color="8A8A8A"/>
             </w:tcBorders>
           </w:tcPr>
           <w:p>
@@ -3108,7 +3087,7 @@
           <w:rFonts w:cs="Arial"/>
           <w:b/>
           <w:i w:val="false"/>
-          <w:color w:val="002516"/>
+          <w:color w:val="222222"/>
           <w:sz w:val="25"/>
         </w:rPr>
         <w:t>Product Architecture</w:t>
@@ -3157,17 +3136,16 @@
           <w:tcPr>
             <w:tcW w:w="2040" w:type="dxa"/>
             <w:tcBorders>
-              <w:top w:val="single" w:sz="4" w:space="0" w:color="A89662"/>
-              <w:left w:val="single" w:sz="4" w:space="0" w:color="A89662"/>
-              <w:bottom w:val="single" w:sz="4" w:space="0" w:color="D9D9D2"/>
-              <w:right w:val="single" w:sz="4" w:space="0" w:color="D9D9D2"/>
-            </w:tcBorders>
-            <w:shd w:color="auto" w:fill="002516" w:val="clear"/>
-          </w:tcPr>
-          <w:p>
-            <w:pPr>
-              <w:pStyle w:val="Normal"/>
-              <w:keepNext w:val="true"/>
+              <w:top w:val="single" w:sz="4" w:space="0" w:color="8A8A8A"/>
+              <w:left w:val="single" w:sz="4" w:space="0" w:color="8A8A8A"/>
+              <w:bottom w:val="single" w:sz="4" w:space="0" w:color="D9D9D2"/>
+              <w:right w:val="single" w:sz="4" w:space="0" w:color="D9D9D2"/>
+            </w:tcBorders>
+            <w:shd w:color="auto" w:fill="222222" w:val="clear"/>
+          </w:tcPr>
+          <w:p>
+            <w:pPr>
+              <w:pStyle w:val="Normal"/>
               <w:spacing w:lineRule="auto" w:line="252" w:before="0" w:after="0"/>
               <w:rPr/>
             </w:pPr>
@@ -3187,17 +3165,16 @@
           <w:tcPr>
             <w:tcW w:w="3629" w:type="dxa"/>
             <w:tcBorders>
-              <w:top w:val="single" w:sz="4" w:space="0" w:color="A89662"/>
-              <w:left w:val="single" w:sz="4" w:space="0" w:color="D9D9D2"/>
-              <w:bottom w:val="single" w:sz="4" w:space="0" w:color="D9D9D2"/>
-              <w:right w:val="single" w:sz="4" w:space="0" w:color="D9D9D2"/>
-            </w:tcBorders>
-            <w:shd w:color="auto" w:fill="002516" w:val="clear"/>
-          </w:tcPr>
-          <w:p>
-            <w:pPr>
-              <w:pStyle w:val="Normal"/>
-              <w:keepNext w:val="true"/>
+              <w:top w:val="single" w:sz="4" w:space="0" w:color="8A8A8A"/>
+              <w:left w:val="single" w:sz="4" w:space="0" w:color="D9D9D2"/>
+              <w:bottom w:val="single" w:sz="4" w:space="0" w:color="D9D9D2"/>
+              <w:right w:val="single" w:sz="4" w:space="0" w:color="D9D9D2"/>
+            </w:tcBorders>
+            <w:shd w:color="auto" w:fill="222222" w:val="clear"/>
+          </w:tcPr>
+          <w:p>
+            <w:pPr>
+              <w:pStyle w:val="Normal"/>
               <w:spacing w:lineRule="auto" w:line="252" w:before="0" w:after="0"/>
               <w:rPr/>
             </w:pPr>
@@ -3217,17 +3194,16 @@
           <w:tcPr>
             <w:tcW w:w="3628" w:type="dxa"/>
             <w:tcBorders>
-              <w:top w:val="single" w:sz="4" w:space="0" w:color="A89662"/>
-              <w:left w:val="single" w:sz="4" w:space="0" w:color="D9D9D2"/>
-              <w:bottom w:val="single" w:sz="4" w:space="0" w:color="D9D9D2"/>
-              <w:right w:val="single" w:sz="4" w:space="0" w:color="A89662"/>
-            </w:tcBorders>
-            <w:shd w:color="auto" w:fill="002516" w:val="clear"/>
-          </w:tcPr>
-          <w:p>
-            <w:pPr>
-              <w:pStyle w:val="Normal"/>
-              <w:keepNext w:val="true"/>
+              <w:top w:val="single" w:sz="4" w:space="0" w:color="8A8A8A"/>
+              <w:left w:val="single" w:sz="4" w:space="0" w:color="D9D9D2"/>
+              <w:bottom w:val="single" w:sz="4" w:space="0" w:color="D9D9D2"/>
+              <w:right w:val="single" w:sz="4" w:space="0" w:color="8A8A8A"/>
+            </w:tcBorders>
+            <w:shd w:color="auto" w:fill="222222" w:val="clear"/>
+          </w:tcPr>
+          <w:p>
+            <w:pPr>
+              <w:pStyle w:val="Normal"/>
               <w:spacing w:lineRule="auto" w:line="252" w:before="0" w:after="0"/>
               <w:rPr/>
             </w:pPr>
@@ -3253,16 +3229,15 @@
             <w:tcW w:w="2040" w:type="dxa"/>
             <w:tcBorders>
               <w:top w:val="single" w:sz="4" w:space="0" w:color="D9D9D2"/>
-              <w:left w:val="single" w:sz="4" w:space="0" w:color="A89662"/>
-              <w:bottom w:val="single" w:sz="4" w:space="0" w:color="D9D9D2"/>
-              <w:right w:val="single" w:sz="4" w:space="0" w:color="D9D9D2"/>
-            </w:tcBorders>
-            <w:shd w:color="auto" w:fill="CDD2B7" w:val="clear"/>
-          </w:tcPr>
-          <w:p>
-            <w:pPr>
-              <w:pStyle w:val="Normal"/>
-              <w:keepNext w:val="true"/>
+              <w:left w:val="single" w:sz="4" w:space="0" w:color="8A8A8A"/>
+              <w:bottom w:val="single" w:sz="4" w:space="0" w:color="D9D9D2"/>
+              <w:right w:val="single" w:sz="4" w:space="0" w:color="D9D9D2"/>
+            </w:tcBorders>
+            <w:shd w:color="auto" w:fill="E6E6E2" w:val="clear"/>
+          </w:tcPr>
+          <w:p>
+            <w:pPr>
+              <w:pStyle w:val="Normal"/>
               <w:spacing w:lineRule="auto" w:line="252" w:before="0" w:after="0"/>
               <w:rPr/>
             </w:pPr>
@@ -3271,7 +3246,7 @@
                 <w:rFonts w:cs="Arial"/>
                 <w:b/>
                 <w:i w:val="false"/>
-                <w:color w:val="002516"/>
+                <w:color w:val="222222"/>
                 <w:sz w:val="17"/>
               </w:rPr>
               <w:t>System</w:t>
@@ -3291,7 +3266,6 @@
           <w:p>
             <w:pPr>
               <w:pStyle w:val="Normal"/>
-              <w:keepNext w:val="true"/>
               <w:spacing w:lineRule="auto" w:line="252" w:before="0" w:after="0"/>
               <w:rPr/>
             </w:pPr>
@@ -3313,13 +3287,12 @@
               <w:top w:val="single" w:sz="4" w:space="0" w:color="D9D9D2"/>
               <w:left w:val="single" w:sz="4" w:space="0" w:color="D9D9D2"/>
               <w:bottom w:val="single" w:sz="4" w:space="0" w:color="D9D9D2"/>
-              <w:right w:val="single" w:sz="4" w:space="0" w:color="A89662"/>
-            </w:tcBorders>
-          </w:tcPr>
-          <w:p>
-            <w:pPr>
-              <w:pStyle w:val="Normal"/>
-              <w:keepNext w:val="true"/>
+              <w:right w:val="single" w:sz="4" w:space="0" w:color="8A8A8A"/>
+            </w:tcBorders>
+          </w:tcPr>
+          <w:p>
+            <w:pPr>
+              <w:pStyle w:val="Normal"/>
               <w:spacing w:lineRule="auto" w:line="252" w:before="0" w:after="0"/>
               <w:rPr/>
             </w:pPr>
@@ -3344,16 +3317,15 @@
             <w:tcW w:w="2040" w:type="dxa"/>
             <w:tcBorders>
               <w:top w:val="single" w:sz="4" w:space="0" w:color="D9D9D2"/>
-              <w:left w:val="single" w:sz="4" w:space="0" w:color="A89662"/>
-              <w:bottom w:val="single" w:sz="4" w:space="0" w:color="D9D9D2"/>
-              <w:right w:val="single" w:sz="4" w:space="0" w:color="D9D9D2"/>
-            </w:tcBorders>
-            <w:shd w:color="auto" w:fill="CDD2B7" w:val="clear"/>
-          </w:tcPr>
-          <w:p>
-            <w:pPr>
-              <w:pStyle w:val="Normal"/>
-              <w:keepNext w:val="true"/>
+              <w:left w:val="single" w:sz="4" w:space="0" w:color="8A8A8A"/>
+              <w:bottom w:val="single" w:sz="4" w:space="0" w:color="D9D9D2"/>
+              <w:right w:val="single" w:sz="4" w:space="0" w:color="D9D9D2"/>
+            </w:tcBorders>
+            <w:shd w:color="auto" w:fill="E6E6E2" w:val="clear"/>
+          </w:tcPr>
+          <w:p>
+            <w:pPr>
+              <w:pStyle w:val="Normal"/>
               <w:spacing w:lineRule="auto" w:line="252" w:before="0" w:after="0"/>
               <w:rPr/>
             </w:pPr>
@@ -3362,7 +3334,7 @@
                 <w:rFonts w:cs="Arial"/>
                 <w:b/>
                 <w:i w:val="false"/>
-                <w:color w:val="002516"/>
+                <w:color w:val="222222"/>
                 <w:sz w:val="17"/>
               </w:rPr>
               <w:t>Product</w:t>
@@ -3382,7 +3354,6 @@
           <w:p>
             <w:pPr>
               <w:pStyle w:val="Normal"/>
-              <w:keepNext w:val="true"/>
               <w:spacing w:lineRule="auto" w:line="252" w:before="0" w:after="0"/>
               <w:rPr/>
             </w:pPr>
@@ -3404,13 +3375,12 @@
               <w:top w:val="single" w:sz="4" w:space="0" w:color="D9D9D2"/>
               <w:left w:val="single" w:sz="4" w:space="0" w:color="D9D9D2"/>
               <w:bottom w:val="single" w:sz="4" w:space="0" w:color="D9D9D2"/>
-              <w:right w:val="single" w:sz="4" w:space="0" w:color="A89662"/>
-            </w:tcBorders>
-          </w:tcPr>
-          <w:p>
-            <w:pPr>
-              <w:pStyle w:val="Normal"/>
-              <w:keepNext w:val="true"/>
+              <w:right w:val="single" w:sz="4" w:space="0" w:color="8A8A8A"/>
+            </w:tcBorders>
+          </w:tcPr>
+          <w:p>
+            <w:pPr>
+              <w:pStyle w:val="Normal"/>
               <w:spacing w:lineRule="auto" w:line="252" w:before="0" w:after="0"/>
               <w:rPr/>
             </w:pPr>
@@ -3435,16 +3405,15 @@
             <w:tcW w:w="2040" w:type="dxa"/>
             <w:tcBorders>
               <w:top w:val="single" w:sz="4" w:space="0" w:color="D9D9D2"/>
-              <w:left w:val="single" w:sz="4" w:space="0" w:color="A89662"/>
-              <w:bottom w:val="single" w:sz="4" w:space="0" w:color="D9D9D2"/>
-              <w:right w:val="single" w:sz="4" w:space="0" w:color="D9D9D2"/>
-            </w:tcBorders>
-            <w:shd w:color="auto" w:fill="CDD2B7" w:val="clear"/>
-          </w:tcPr>
-          <w:p>
-            <w:pPr>
-              <w:pStyle w:val="Normal"/>
-              <w:keepNext w:val="true"/>
+              <w:left w:val="single" w:sz="4" w:space="0" w:color="8A8A8A"/>
+              <w:bottom w:val="single" w:sz="4" w:space="0" w:color="D9D9D2"/>
+              <w:right w:val="single" w:sz="4" w:space="0" w:color="D9D9D2"/>
+            </w:tcBorders>
+            <w:shd w:color="auto" w:fill="E6E6E2" w:val="clear"/>
+          </w:tcPr>
+          <w:p>
+            <w:pPr>
+              <w:pStyle w:val="Normal"/>
               <w:spacing w:lineRule="auto" w:line="252" w:before="0" w:after="0"/>
               <w:rPr/>
             </w:pPr>
@@ -3453,7 +3422,7 @@
                 <w:rFonts w:cs="Arial"/>
                 <w:b/>
                 <w:i w:val="false"/>
-                <w:color w:val="002516"/>
+                <w:color w:val="222222"/>
                 <w:sz w:val="17"/>
               </w:rPr>
               <w:t>Element</w:t>
@@ -3473,7 +3442,6 @@
           <w:p>
             <w:pPr>
               <w:pStyle w:val="Normal"/>
-              <w:keepNext w:val="true"/>
               <w:spacing w:lineRule="auto" w:line="252" w:before="0" w:after="0"/>
               <w:rPr/>
             </w:pPr>
@@ -3495,13 +3463,12 @@
               <w:top w:val="single" w:sz="4" w:space="0" w:color="D9D9D2"/>
               <w:left w:val="single" w:sz="4" w:space="0" w:color="D9D9D2"/>
               <w:bottom w:val="single" w:sz="4" w:space="0" w:color="D9D9D2"/>
-              <w:right w:val="single" w:sz="4" w:space="0" w:color="A89662"/>
-            </w:tcBorders>
-          </w:tcPr>
-          <w:p>
-            <w:pPr>
-              <w:pStyle w:val="Normal"/>
-              <w:keepNext w:val="true"/>
+              <w:right w:val="single" w:sz="4" w:space="0" w:color="8A8A8A"/>
+            </w:tcBorders>
+          </w:tcPr>
+          <w:p>
+            <w:pPr>
+              <w:pStyle w:val="Normal"/>
               <w:spacing w:lineRule="auto" w:line="252" w:before="0" w:after="0"/>
               <w:rPr/>
             </w:pPr>
@@ -3526,16 +3493,15 @@
             <w:tcW w:w="2040" w:type="dxa"/>
             <w:tcBorders>
               <w:top w:val="single" w:sz="4" w:space="0" w:color="D9D9D2"/>
-              <w:left w:val="single" w:sz="4" w:space="0" w:color="A89662"/>
-              <w:bottom w:val="single" w:sz="4" w:space="0" w:color="D9D9D2"/>
-              <w:right w:val="single" w:sz="4" w:space="0" w:color="D9D9D2"/>
-            </w:tcBorders>
-            <w:shd w:color="auto" w:fill="CDD2B7" w:val="clear"/>
-          </w:tcPr>
-          <w:p>
-            <w:pPr>
-              <w:pStyle w:val="Normal"/>
-              <w:keepNext w:val="true"/>
+              <w:left w:val="single" w:sz="4" w:space="0" w:color="8A8A8A"/>
+              <w:bottom w:val="single" w:sz="4" w:space="0" w:color="D9D9D2"/>
+              <w:right w:val="single" w:sz="4" w:space="0" w:color="D9D9D2"/>
+            </w:tcBorders>
+            <w:shd w:color="auto" w:fill="E6E6E2" w:val="clear"/>
+          </w:tcPr>
+          <w:p>
+            <w:pPr>
+              <w:pStyle w:val="Normal"/>
               <w:spacing w:lineRule="auto" w:line="252" w:before="0" w:after="0"/>
               <w:rPr/>
             </w:pPr>
@@ -3544,7 +3510,7 @@
                 <w:rFonts w:cs="Arial"/>
                 <w:b/>
                 <w:i w:val="false"/>
-                <w:color w:val="002516"/>
+                <w:color w:val="222222"/>
                 <w:sz w:val="17"/>
               </w:rPr>
               <w:t>Element</w:t>
@@ -3564,7 +3530,6 @@
           <w:p>
             <w:pPr>
               <w:pStyle w:val="Normal"/>
-              <w:keepNext w:val="true"/>
               <w:spacing w:lineRule="auto" w:line="252" w:before="0" w:after="0"/>
               <w:rPr/>
             </w:pPr>
@@ -3586,13 +3551,12 @@
               <w:top w:val="single" w:sz="4" w:space="0" w:color="D9D9D2"/>
               <w:left w:val="single" w:sz="4" w:space="0" w:color="D9D9D2"/>
               <w:bottom w:val="single" w:sz="4" w:space="0" w:color="D9D9D2"/>
-              <w:right w:val="single" w:sz="4" w:space="0" w:color="A89662"/>
-            </w:tcBorders>
-          </w:tcPr>
-          <w:p>
-            <w:pPr>
-              <w:pStyle w:val="Normal"/>
-              <w:keepNext w:val="true"/>
+              <w:right w:val="single" w:sz="4" w:space="0" w:color="8A8A8A"/>
+            </w:tcBorders>
+          </w:tcPr>
+          <w:p>
+            <w:pPr>
+              <w:pStyle w:val="Normal"/>
               <w:spacing w:lineRule="auto" w:line="252" w:before="0" w:after="0"/>
               <w:rPr/>
             </w:pPr>
@@ -3617,16 +3581,15 @@
             <w:tcW w:w="2040" w:type="dxa"/>
             <w:tcBorders>
               <w:top w:val="single" w:sz="4" w:space="0" w:color="D9D9D2"/>
-              <w:left w:val="single" w:sz="4" w:space="0" w:color="A89662"/>
-              <w:bottom w:val="single" w:sz="4" w:space="0" w:color="D9D9D2"/>
-              <w:right w:val="single" w:sz="4" w:space="0" w:color="D9D9D2"/>
-            </w:tcBorders>
-            <w:shd w:color="auto" w:fill="CDD2B7" w:val="clear"/>
-          </w:tcPr>
-          <w:p>
-            <w:pPr>
-              <w:pStyle w:val="Normal"/>
-              <w:keepNext w:val="true"/>
+              <w:left w:val="single" w:sz="4" w:space="0" w:color="8A8A8A"/>
+              <w:bottom w:val="single" w:sz="4" w:space="0" w:color="D9D9D2"/>
+              <w:right w:val="single" w:sz="4" w:space="0" w:color="D9D9D2"/>
+            </w:tcBorders>
+            <w:shd w:color="auto" w:fill="E6E6E2" w:val="clear"/>
+          </w:tcPr>
+          <w:p>
+            <w:pPr>
+              <w:pStyle w:val="Normal"/>
               <w:spacing w:lineRule="auto" w:line="252" w:before="0" w:after="0"/>
               <w:rPr/>
             </w:pPr>
@@ -3635,7 +3598,7 @@
                 <w:rFonts w:cs="Arial"/>
                 <w:b/>
                 <w:i w:val="false"/>
-                <w:color w:val="002516"/>
+                <w:color w:val="222222"/>
                 <w:sz w:val="17"/>
               </w:rPr>
               <w:t>Element</w:t>
@@ -3655,7 +3618,6 @@
           <w:p>
             <w:pPr>
               <w:pStyle w:val="Normal"/>
-              <w:keepNext w:val="true"/>
               <w:spacing w:lineRule="auto" w:line="252" w:before="0" w:after="0"/>
               <w:rPr/>
             </w:pPr>
@@ -3677,13 +3639,12 @@
               <w:top w:val="single" w:sz="4" w:space="0" w:color="D9D9D2"/>
               <w:left w:val="single" w:sz="4" w:space="0" w:color="D9D9D2"/>
               <w:bottom w:val="single" w:sz="4" w:space="0" w:color="D9D9D2"/>
-              <w:right w:val="single" w:sz="4" w:space="0" w:color="A89662"/>
-            </w:tcBorders>
-          </w:tcPr>
-          <w:p>
-            <w:pPr>
-              <w:pStyle w:val="Normal"/>
-              <w:keepNext w:val="true"/>
+              <w:right w:val="single" w:sz="4" w:space="0" w:color="8A8A8A"/>
+            </w:tcBorders>
+          </w:tcPr>
+          <w:p>
+            <w:pPr>
+              <w:pStyle w:val="Normal"/>
               <w:spacing w:lineRule="auto" w:line="252" w:before="0" w:after="0"/>
               <w:rPr/>
             </w:pPr>
@@ -3708,16 +3669,15 @@
             <w:tcW w:w="2040" w:type="dxa"/>
             <w:tcBorders>
               <w:top w:val="single" w:sz="4" w:space="0" w:color="D9D9D2"/>
-              <w:left w:val="single" w:sz="4" w:space="0" w:color="A89662"/>
-              <w:bottom w:val="single" w:sz="4" w:space="0" w:color="D9D9D2"/>
-              <w:right w:val="single" w:sz="4" w:space="0" w:color="D9D9D2"/>
-            </w:tcBorders>
-            <w:shd w:color="auto" w:fill="CDD2B7" w:val="clear"/>
-          </w:tcPr>
-          <w:p>
-            <w:pPr>
-              <w:pStyle w:val="Normal"/>
-              <w:keepNext w:val="true"/>
+              <w:left w:val="single" w:sz="4" w:space="0" w:color="8A8A8A"/>
+              <w:bottom w:val="single" w:sz="4" w:space="0" w:color="D9D9D2"/>
+              <w:right w:val="single" w:sz="4" w:space="0" w:color="D9D9D2"/>
+            </w:tcBorders>
+            <w:shd w:color="auto" w:fill="E6E6E2" w:val="clear"/>
+          </w:tcPr>
+          <w:p>
+            <w:pPr>
+              <w:pStyle w:val="Normal"/>
               <w:spacing w:lineRule="auto" w:line="252" w:before="0" w:after="0"/>
               <w:rPr/>
             </w:pPr>
@@ -3726,7 +3686,7 @@
                 <w:rFonts w:cs="Arial"/>
                 <w:b/>
                 <w:i w:val="false"/>
-                <w:color w:val="002516"/>
+                <w:color w:val="222222"/>
                 <w:sz w:val="17"/>
               </w:rPr>
               <w:t>Element</w:t>
@@ -3746,7 +3706,6 @@
           <w:p>
             <w:pPr>
               <w:pStyle w:val="Normal"/>
-              <w:keepNext w:val="true"/>
               <w:spacing w:lineRule="auto" w:line="252" w:before="0" w:after="0"/>
               <w:rPr/>
             </w:pPr>
@@ -3768,13 +3727,12 @@
               <w:top w:val="single" w:sz="4" w:space="0" w:color="D9D9D2"/>
               <w:left w:val="single" w:sz="4" w:space="0" w:color="D9D9D2"/>
               <w:bottom w:val="single" w:sz="4" w:space="0" w:color="D9D9D2"/>
-              <w:right w:val="single" w:sz="4" w:space="0" w:color="A89662"/>
-            </w:tcBorders>
-          </w:tcPr>
-          <w:p>
-            <w:pPr>
-              <w:pStyle w:val="Normal"/>
-              <w:keepNext w:val="true"/>
+              <w:right w:val="single" w:sz="4" w:space="0" w:color="8A8A8A"/>
+            </w:tcBorders>
+          </w:tcPr>
+          <w:p>
+            <w:pPr>
+              <w:pStyle w:val="Normal"/>
               <w:spacing w:lineRule="auto" w:line="252" w:before="0" w:after="0"/>
               <w:rPr/>
             </w:pPr>
@@ -3799,16 +3757,15 @@
             <w:tcW w:w="2040" w:type="dxa"/>
             <w:tcBorders>
               <w:top w:val="single" w:sz="4" w:space="0" w:color="D9D9D2"/>
-              <w:left w:val="single" w:sz="4" w:space="0" w:color="A89662"/>
-              <w:bottom w:val="single" w:sz="4" w:space="0" w:color="D9D9D2"/>
-              <w:right w:val="single" w:sz="4" w:space="0" w:color="D9D9D2"/>
-            </w:tcBorders>
-            <w:shd w:color="auto" w:fill="CDD2B7" w:val="clear"/>
-          </w:tcPr>
-          <w:p>
-            <w:pPr>
-              <w:pStyle w:val="Normal"/>
-              <w:keepNext w:val="true"/>
+              <w:left w:val="single" w:sz="4" w:space="0" w:color="8A8A8A"/>
+              <w:bottom w:val="single" w:sz="4" w:space="0" w:color="D9D9D2"/>
+              <w:right w:val="single" w:sz="4" w:space="0" w:color="D9D9D2"/>
+            </w:tcBorders>
+            <w:shd w:color="auto" w:fill="E6E6E2" w:val="clear"/>
+          </w:tcPr>
+          <w:p>
+            <w:pPr>
+              <w:pStyle w:val="Normal"/>
               <w:spacing w:lineRule="auto" w:line="252" w:before="0" w:after="0"/>
               <w:rPr/>
             </w:pPr>
@@ -3817,7 +3774,7 @@
                 <w:rFonts w:cs="Arial"/>
                 <w:b/>
                 <w:i w:val="false"/>
-                <w:color w:val="002516"/>
+                <w:color w:val="222222"/>
                 <w:sz w:val="17"/>
               </w:rPr>
               <w:t>Element</w:t>
@@ -3837,7 +3794,6 @@
           <w:p>
             <w:pPr>
               <w:pStyle w:val="Normal"/>
-              <w:keepNext w:val="true"/>
               <w:spacing w:lineRule="auto" w:line="252" w:before="0" w:after="0"/>
               <w:rPr/>
             </w:pPr>
@@ -3859,13 +3815,12 @@
               <w:top w:val="single" w:sz="4" w:space="0" w:color="D9D9D2"/>
               <w:left w:val="single" w:sz="4" w:space="0" w:color="D9D9D2"/>
               <w:bottom w:val="single" w:sz="4" w:space="0" w:color="D9D9D2"/>
-              <w:right w:val="single" w:sz="4" w:space="0" w:color="A89662"/>
-            </w:tcBorders>
-          </w:tcPr>
-          <w:p>
-            <w:pPr>
-              <w:pStyle w:val="Normal"/>
-              <w:keepNext w:val="true"/>
+              <w:right w:val="single" w:sz="4" w:space="0" w:color="8A8A8A"/>
+            </w:tcBorders>
+          </w:tcPr>
+          <w:p>
+            <w:pPr>
+              <w:pStyle w:val="Normal"/>
               <w:spacing w:lineRule="auto" w:line="252" w:before="0" w:after="0"/>
               <w:rPr/>
             </w:pPr>
@@ -3890,11 +3845,11 @@
             <w:tcW w:w="2040" w:type="dxa"/>
             <w:tcBorders>
               <w:top w:val="single" w:sz="4" w:space="0" w:color="D9D9D2"/>
-              <w:left w:val="single" w:sz="4" w:space="0" w:color="A89662"/>
-              <w:bottom w:val="single" w:sz="4" w:space="0" w:color="A89662"/>
-              <w:right w:val="single" w:sz="4" w:space="0" w:color="D9D9D2"/>
-            </w:tcBorders>
-            <w:shd w:color="auto" w:fill="CDD2B7" w:val="clear"/>
+              <w:left w:val="single" w:sz="4" w:space="0" w:color="8A8A8A"/>
+              <w:bottom w:val="single" w:sz="4" w:space="0" w:color="8A8A8A"/>
+              <w:right w:val="single" w:sz="4" w:space="0" w:color="D9D9D2"/>
+            </w:tcBorders>
+            <w:shd w:color="auto" w:fill="E6E6E2" w:val="clear"/>
           </w:tcPr>
           <w:p>
             <w:pPr>
@@ -3907,7 +3862,7 @@
                 <w:rFonts w:cs="Arial"/>
                 <w:b/>
                 <w:i w:val="false"/>
-                <w:color w:val="002516"/>
+                <w:color w:val="222222"/>
                 <w:sz w:val="17"/>
               </w:rPr>
               <w:t>Outcome</w:t>
@@ -3920,7 +3875,7 @@
             <w:tcBorders>
               <w:top w:val="single" w:sz="4" w:space="0" w:color="D9D9D2"/>
               <w:left w:val="single" w:sz="4" w:space="0" w:color="D9D9D2"/>
-              <w:bottom w:val="single" w:sz="4" w:space="0" w:color="A89662"/>
+              <w:bottom w:val="single" w:sz="4" w:space="0" w:color="8A8A8A"/>
               <w:right w:val="single" w:sz="4" w:space="0" w:color="D9D9D2"/>
             </w:tcBorders>
           </w:tcPr>
@@ -3947,8 +3902,8 @@
             <w:tcBorders>
               <w:top w:val="single" w:sz="4" w:space="0" w:color="D9D9D2"/>
               <w:left w:val="single" w:sz="4" w:space="0" w:color="D9D9D2"/>
-              <w:bottom w:val="single" w:sz="4" w:space="0" w:color="A89662"/>
-              <w:right w:val="single" w:sz="4" w:space="0" w:color="A89662"/>
+              <w:bottom w:val="single" w:sz="4" w:space="0" w:color="8A8A8A"/>
+              <w:right w:val="single" w:sz="4" w:space="0" w:color="8A8A8A"/>
             </w:tcBorders>
           </w:tcPr>
           <w:p>
@@ -4006,7 +3961,7 @@
           <w:rFonts w:cs="Arial"/>
           <w:b/>
           <w:i w:val="false"/>
-          <w:color w:val="002516"/>
+          <w:color w:val="222222"/>
           <w:sz w:val="25"/>
         </w:rPr>
         <w:t>Sources and Status</w:t>
@@ -4557,7 +4512,7 @@
     <w:rPr>
       <w:rFonts w:ascii="Arial" w:hAnsi="Arial" w:cs="Arial"/>
       <w:b/>
-      <w:color w:val="002516"/>
+      <w:color w:val="222222"/>
       <w:sz w:val="24"/>
     </w:rPr>
   </w:style>
@@ -4578,7 +4533,7 @@
     <w:rPr>
       <w:rFonts w:ascii="Arial" w:hAnsi="Arial" w:cs="Arial"/>
       <w:b/>
-      <w:color w:val="002516"/>
+      <w:color w:val="222222"/>
       <w:sz w:val="24"/>
     </w:rPr>
   </w:style>

</xml_diff>